<commit_message>
Permuta Word: carregar pizzip/docxtemplater do jsdelivr
cdnjs nao hospeda o pizzip (404). Troca para:
  cdn.jsdelivr.net/npm/pizzip@3.1.7/dist/pizzip.min.js
  cdn.jsdelivr.net/npm/docxtemplater@3.44.0/build/docxtemplater.js

Co-Authored-By: Claude Sonnet 5 <noreply@anthropic.com>
</commit_message>
<xml_diff>
--- a/web/termos/permuta-modelo.docx
+++ b/web/termos/permuta-modelo.docx
@@ -310,226 +310,6 @@
         </w:rPr>
       </w:pPr>
     </w:p>
-    <w:p>
-      <w:pPr>
-        <w:pStyle w:val="Corpodetexto"/>
-        <w:spacing w:line="276" w:lineRule="auto"/>
-        <w:ind w:left="775" w:right="842"/>
-        <w:rPr>
-          <w:rFonts w:ascii="Arial" w:eastAsia="Arial" w:hAnsi="Arial" w:cs="Arial"/>
-          <w:b/>
-          <w:sz w:val="24"/>
-          <w:szCs w:val="24"/>
-        </w:rPr>
-      </w:pPr>
-      <w:r>
-        <w:rPr>
-          <w:rFonts w:ascii="Arial" w:eastAsia="Arial" w:hAnsi="Arial" w:cs="Arial"/>
-          <w:b/>
-          <w:sz w:val="24"/>
-          <w:szCs w:val="24"/>
-        </w:rPr>
-        <w:t xml:space="preserve">DATA DA PERMUTA: </w:t>
-      </w:r>
-      <w:r>
-        <w:rPr>
-          <w:rFonts w:ascii="Arial" w:eastAsia="Arial" w:hAnsi="Arial" w:cs="Arial"/>
-          <w:b/>
-          <w:sz w:val="24"/>
-          <w:szCs w:val="24"/>
-        </w:rPr>
-        <w:t>{data_permuta}</w:t>
-      </w:r>
-      <w:r>
-        <w:rPr>
-          <w:rFonts w:ascii="Arial" w:eastAsia="Arial" w:hAnsi="Arial" w:cs="Arial"/>
-          <w:b/>
-          <w:sz w:val="24"/>
-          <w:szCs w:val="24"/>
-        </w:rPr>
-        <w:t xml:space="preserve"> TURNO: </w:t>
-      </w:r>
-      <w:r>
-        <w:rPr>
-          <w:rFonts w:ascii="Arial" w:eastAsia="Arial" w:hAnsi="Arial" w:cs="Arial"/>
-          <w:b/>
-          <w:sz w:val="24"/>
-          <w:szCs w:val="24"/>
-        </w:rPr>
-        <w:t>({turno_diurno}) </w:t>
-      </w:r>
-      <w:r>
-        <w:rPr>
-          <w:rFonts w:ascii="Arial" w:eastAsia="Arial" w:hAnsi="Arial" w:cs="Arial"/>
-          <w:b/>
-          <w:sz w:val="24"/>
-          <w:szCs w:val="24"/>
-        </w:rPr>
-        <w:t>0</w:t>
-      </w:r>
-      <w:r>
-        <w:rPr>
-          <w:rFonts w:ascii="Arial" w:eastAsia="Arial" w:hAnsi="Arial" w:cs="Arial"/>
-          <w:b/>
-          <w:sz w:val="24"/>
-          <w:szCs w:val="24"/>
-        </w:rPr>
-        <w:t>8h às 20h</w:t>
-      </w:r>
-      <w:r>
-        <w:rPr>
-          <w:rFonts w:ascii="Arial" w:eastAsia="Arial" w:hAnsi="Arial" w:cs="Arial"/>
-          <w:b/>
-          <w:sz w:val="24"/>
-          <w:szCs w:val="24"/>
-        </w:rPr>
-        <w:t xml:space="preserve">  </w:t>
-      </w:r>
-      <w:r>
-        <w:rPr>
-          <w:rFonts w:ascii="Arial" w:eastAsia="Arial" w:hAnsi="Arial" w:cs="Arial"/>
-          <w:b/>
-          <w:sz w:val="24"/>
-          <w:szCs w:val="24"/>
-        </w:rPr>
-        <w:t>({turno_</w:t>
-      </w:r>
-      <w:r>
-        <w:rPr>
-          <w:rFonts w:ascii="Arial" w:eastAsia="Arial" w:hAnsi="Arial" w:cs="Arial"/>
-          <w:b/>
-          <w:sz w:val="24"/>
-          <w:szCs w:val="24"/>
-        </w:rPr>
-        <w:t>NOTURNO</w:t>
-      </w:r>
-      <w:r>
-        <w:rPr>
-          <w:rFonts w:ascii="Arial" w:eastAsia="Arial" w:hAnsi="Arial" w:cs="Arial"/>
-          <w:b/>
-          <w:sz w:val="24"/>
-          <w:szCs w:val="24"/>
-        </w:rPr>
-        <w:t>}) </w:t>
-      </w:r>
-      <w:r>
-        <w:rPr>
-          <w:rFonts w:ascii="Arial" w:eastAsia="Arial" w:hAnsi="Arial" w:cs="Arial"/>
-          <w:b/>
-          <w:sz w:val="24"/>
-          <w:szCs w:val="24"/>
-        </w:rPr>
-        <w:t>20</w:t>
-      </w:r>
-      <w:r>
-        <w:rPr>
-          <w:rFonts w:ascii="Arial" w:eastAsia="Arial" w:hAnsi="Arial" w:cs="Arial"/>
-          <w:b/>
-          <w:sz w:val="24"/>
-          <w:szCs w:val="24"/>
-        </w:rPr>
-        <w:t xml:space="preserve">h às </w:t>
-      </w:r>
-      <w:r>
-        <w:rPr>
-          <w:rFonts w:ascii="Arial" w:eastAsia="Arial" w:hAnsi="Arial" w:cs="Arial"/>
-          <w:b/>
-          <w:sz w:val="24"/>
-          <w:szCs w:val="24"/>
-        </w:rPr>
-        <w:t>08</w:t>
-      </w:r>
-      <w:r>
-        <w:rPr>
-          <w:rFonts w:ascii="Arial" w:eastAsia="Arial" w:hAnsi="Arial" w:cs="Arial"/>
-          <w:b/>
-          <w:sz w:val="24"/>
-          <w:szCs w:val="24"/>
-        </w:rPr>
-        <w:t>h</w:t>
-      </w:r>
-    </w:p>
-    <w:p>
-      <w:pPr>
-        <w:pStyle w:val="Corpodetexto"/>
-        <w:spacing w:line="276" w:lineRule="auto"/>
-        <w:ind w:left="775" w:right="842"/>
-        <w:rPr>
-          <w:rFonts w:ascii="Arial" w:eastAsia="Arial" w:hAnsi="Arial" w:cs="Arial"/>
-          <w:b/>
-          <w:bCs/>
-          <w:sz w:val="24"/>
-          <w:szCs w:val="24"/>
-          <w:u w:val="thick" w:color="000000"/>
-          <w:shd w:val="clear" w:color="auto" w:fill="D9D9D9"/>
-        </w:rPr>
-      </w:pPr>
-      <w:r>
-        <w:rPr>
-          <w:rFonts w:ascii="Arial" w:eastAsia="Arial" w:hAnsi="Arial" w:cs="Arial"/>
-          <w:b/>
-          <w:sz w:val="24"/>
-          <w:szCs w:val="24"/>
-        </w:rPr>
-        <w:br/>
-      </w:r>
-      <w:r>
-        <w:rPr>
-          <w:rFonts w:ascii="Arial" w:eastAsia="Arial" w:hAnsi="Arial" w:cs="Arial"/>
-          <w:b/>
-          <w:bCs/>
-          <w:sz w:val="24"/>
-          <w:szCs w:val="24"/>
-          <w:u w:val="thick" w:color="000000"/>
-          <w:shd w:val="clear" w:color="auto" w:fill="D9D9D9"/>
-        </w:rPr>
-        <w:t>NOME DO REQUERENTE A SER SUBSTITUÍDO(QUEM SERÁ SUBSTITUÍDO):</w:t>
-      </w:r>
-    </w:p>
-    <w:p>
-      <w:pPr>
-        <w:pStyle w:val="Corpodetexto"/>
-        <w:spacing w:line="276" w:lineRule="auto"/>
-        <w:ind w:left="775" w:right="842"/>
-        <w:rPr>
-          <w:rFonts w:ascii="Arial" w:eastAsia="Arial" w:hAnsi="Arial" w:cs="Arial"/>
-          <w:b/>
-          <w:bCs/>
-          <w:sz w:val="24"/>
-          <w:szCs w:val="24"/>
-          <w:u w:val="thick" w:color="000000"/>
-          <w:shd w:val="clear" w:color="auto" w:fill="D9D9D9"/>
-        </w:rPr>
-      </w:pPr>
-      <w:r>
-        <w:rPr>
-          <w:rFonts w:ascii="Arial" w:eastAsia="Arial" w:hAnsi="Arial" w:cs="Arial"/>
-          <w:b/>
-          <w:bCs/>
-          <w:sz w:val="24"/>
-          <w:szCs w:val="24"/>
-          <w:u w:val="thick" w:color="000000"/>
-          <w:shd w:val="clear" w:color="auto" w:fill="D9D9D9"/>
-        </w:rPr>
-        <w:t>{s_nome}</w:t>
-      </w:r>
-    </w:p>
-    <w:p>
-      <w:pPr>
-        <w:pStyle w:val="Corpodetexto"/>
-        <w:spacing w:line="276" w:lineRule="auto"/>
-        <w:ind w:left="775" w:right="842"/>
-        <w:rPr>
-          <w:rFonts w:ascii="Arial" w:eastAsia="Arial" w:hAnsi="Arial" w:cs="Arial"/>
-          <w:b/>
-          <w:bCs/>
-          <w:sz w:val="24"/>
-          <w:szCs w:val="24"/>
-          <w:u w:val="thick" w:color="000000"/>
-          <w:shd w:val="clear" w:color="auto" w:fill="D9D9D9"/>
-        </w:rPr>
-      </w:pPr>
-    </w:p>
     <w:tbl>
       <w:tblPr>
         <w:tblStyle w:val="Tabelacomgrade"/>
@@ -561,6 +341,15 @@
                 <w:shd w:val="clear" w:color="auto" w:fill="D9D9D9"/>
               </w:rPr>
             </w:pPr>
+            <w:r>
+              <w:rPr>
+                <w:rFonts w:ascii="Arial" w:eastAsia="Arial" w:hAnsi="Arial" w:cs="Arial"/>
+                <w:b/>
+                <w:sz w:val="24"/>
+                <w:szCs w:val="24"/>
+              </w:rPr>
+              <w:br/>
+            </w:r>
             <w:r>
               <w:rPr>
                 <w:rFonts w:ascii="Arial" w:hAnsi="Arial" w:cs="Arial"/>
@@ -837,23 +626,7 @@
                 <w:sz w:val="24"/>
                 <w:szCs w:val="24"/>
               </w:rPr>
-              <w:t>{</w:t>
-            </w:r>
-            <w:r>
-              <w:rPr>
-                <w:b/>
-                <w:sz w:val="24"/>
-                <w:szCs w:val="24"/>
-              </w:rPr>
-              <w:t>s</w:t>
-            </w:r>
-            <w:r>
-              <w:rPr>
-                <w:b/>
-                <w:sz w:val="24"/>
-                <w:szCs w:val="24"/>
-              </w:rPr>
-              <w:t>_nome}</w:t>
+              <w:t>{s_nome}</w:t>
             </w:r>
           </w:p>
         </w:tc>
@@ -886,16 +659,7 @@
                 <w:sz w:val="24"/>
                 <w:szCs w:val="24"/>
               </w:rPr>
-              <w:t xml:space="preserve">CARGO: </w:t>
-            </w:r>
-            <w:r>
-              <w:rPr>
-                <w:rFonts w:ascii="Arial" w:hAnsi="Arial" w:cs="Arial"/>
-                <w:b/>
-                <w:sz w:val="24"/>
-                <w:szCs w:val="24"/>
-              </w:rPr>
-              <w:t>{s_cargo}</w:t>
+              <w:t>CARGO: {s_cargo}</w:t>
             </w:r>
           </w:p>
         </w:tc>
@@ -923,15 +687,7 @@
                 <w:sz w:val="24"/>
                 <w:szCs w:val="24"/>
               </w:rPr>
-              <w:t xml:space="preserve">MATRICULA: </w:t>
-            </w:r>
-            <w:r>
-              <w:rPr>
-                <w:b/>
-                <w:sz w:val="24"/>
-                <w:szCs w:val="24"/>
-              </w:rPr>
-              <w:t>{s_matricula}</w:t>
+              <w:t>MATRICULA: {s_matricula}</w:t>
             </w:r>
           </w:p>
         </w:tc>
@@ -1099,15 +855,7 @@
                 <w:sz w:val="24"/>
                 <w:szCs w:val="24"/>
               </w:rPr>
-              <w:t>NOME DO REQUERENTE SUBSTITUTO</w:t>
-            </w:r>
-            <w:r>
-              <w:rPr>
-                <w:b/>
-                <w:sz w:val="24"/>
-                <w:szCs w:val="24"/>
-              </w:rPr>
-              <w:t>:</w:t>
+              <w:t>NOME DO REQUERENTE SUBSTITUTO:</w:t>
             </w:r>
           </w:p>
         </w:tc>
@@ -1141,23 +889,7 @@
                 <w:sz w:val="24"/>
                 <w:szCs w:val="24"/>
               </w:rPr>
-              <w:t>{</w:t>
-            </w:r>
-            <w:r>
-              <w:rPr>
-                <w:b/>
-                <w:sz w:val="24"/>
-                <w:szCs w:val="24"/>
-              </w:rPr>
-              <w:t>t</w:t>
-            </w:r>
-            <w:r>
-              <w:rPr>
-                <w:b/>
-                <w:sz w:val="24"/>
-                <w:szCs w:val="24"/>
-              </w:rPr>
-              <w:t>_nome}</w:t>
+              <w:t>{t_nome}</w:t>
             </w:r>
           </w:p>
         </w:tc>
@@ -1190,25 +922,7 @@
                 <w:sz w:val="24"/>
                 <w:szCs w:val="24"/>
               </w:rPr>
-              <w:t>CARGO: {</w:t>
-            </w:r>
-            <w:r>
-              <w:rPr>
-                <w:rFonts w:ascii="Arial" w:hAnsi="Arial" w:cs="Arial"/>
-                <w:b/>
-                <w:sz w:val="24"/>
-                <w:szCs w:val="24"/>
-              </w:rPr>
-              <w:t>t</w:t>
-            </w:r>
-            <w:r>
-              <w:rPr>
-                <w:rFonts w:ascii="Arial" w:hAnsi="Arial" w:cs="Arial"/>
-                <w:b/>
-                <w:sz w:val="24"/>
-                <w:szCs w:val="24"/>
-              </w:rPr>
-              <w:t>_cargo}</w:t>
+              <w:t>CARGO: {t_cargo}</w:t>
             </w:r>
           </w:p>
         </w:tc>
@@ -1236,23 +950,7 @@
                 <w:sz w:val="24"/>
                 <w:szCs w:val="24"/>
               </w:rPr>
-              <w:t>MATRICULA: {</w:t>
-            </w:r>
-            <w:r>
-              <w:rPr>
-                <w:b/>
-                <w:sz w:val="24"/>
-                <w:szCs w:val="24"/>
-              </w:rPr>
-              <w:t>t</w:t>
-            </w:r>
-            <w:r>
-              <w:rPr>
-                <w:b/>
-                <w:sz w:val="24"/>
-                <w:szCs w:val="24"/>
-              </w:rPr>
-              <w:t>_matricula}</w:t>
+              <w:t>MATRICULA: {t_matricula}</w:t>
             </w:r>
           </w:p>
         </w:tc>
@@ -1312,23 +1010,7 @@
                 <w:sz w:val="24"/>
                 <w:szCs w:val="24"/>
               </w:rPr>
-              <w:t>PLANTÃO: {</w:t>
-            </w:r>
-            <w:r>
-              <w:rPr>
-                <w:b/>
-                <w:sz w:val="24"/>
-                <w:szCs w:val="24"/>
-              </w:rPr>
-              <w:t>t_</w:t>
-            </w:r>
-            <w:r>
-              <w:rPr>
-                <w:b/>
-                <w:sz w:val="24"/>
-                <w:szCs w:val="24"/>
-              </w:rPr>
-              <w:t>plantao}</w:t>
+              <w:t>PLANTÃO: {t_plantao}</w:t>
             </w:r>
           </w:p>
         </w:tc>
@@ -1361,23 +1043,7 @@
                 <w:sz w:val="24"/>
                 <w:szCs w:val="24"/>
               </w:rPr>
-              <w:t>CELULAR: {</w:t>
-            </w:r>
-            <w:r>
-              <w:rPr>
-                <w:b/>
-                <w:sz w:val="24"/>
-                <w:szCs w:val="24"/>
-              </w:rPr>
-              <w:t>t</w:t>
-            </w:r>
-            <w:r>
-              <w:rPr>
-                <w:b/>
-                <w:sz w:val="24"/>
-                <w:szCs w:val="24"/>
-              </w:rPr>
-              <w:t>_celular}</w:t>
+              <w:t>CELULAR: {t_celular}</w:t>
             </w:r>
           </w:p>
         </w:tc>
@@ -3902,6 +3568,7 @@
   <w:style w:type="character" w:default="1" w:styleId="Fontepargpadro">
     <w:name w:val="Default Paragraph Font"/>
     <w:uiPriority w:val="1"/>
+    <w:semiHidden/>
     <w:unhideWhenUsed/>
   </w:style>
   <w:style w:type="table" w:default="1" w:styleId="Tabelanormal">

</xml_diff>

<commit_message>
Permuta Word: servir pizzip/docxtemplater localmente (web/vendor)
O carregamento via CDN (cdnjs e jsdelivr) falhava atras do service worker.
Agora as libs sao servidas do proprio site (mesma origem), funcionam
offline e entram no cache do SW (v17).

Co-Authored-By: Claude Sonnet 5 <noreply@anthropic.com>
</commit_message>
<xml_diff>
--- a/web/termos/permuta-modelo.docx
+++ b/web/termos/permuta-modelo.docx
@@ -318,13 +318,16 @@
         <w:tblLook w:val="04A0" w:firstRow="1" w:lastRow="0" w:firstColumn="1" w:lastColumn="0" w:noHBand="0" w:noVBand="1"/>
       </w:tblPr>
       <w:tblGrid>
-        <w:gridCol w:w="4749"/>
-        <w:gridCol w:w="5244"/>
+        <w:gridCol w:w="2339"/>
+        <w:gridCol w:w="2693"/>
+        <w:gridCol w:w="1205"/>
+        <w:gridCol w:w="3756"/>
       </w:tblGrid>
       <w:tr>
         <w:tc>
           <w:tcPr>
-            <w:tcW w:w="4749" w:type="dxa"/>
+            <w:tcW w:w="9993" w:type="dxa"/>
+            <w:gridSpan w:val="4"/>
           </w:tcPr>
           <w:p>
             <w:pPr>
@@ -406,12 +409,16 @@
               </w:rPr>
               <w:t>{data_permuta}</w:t>
             </w:r>
+            <w:r>
+              <w:rPr>
+                <w:rFonts w:ascii="Arial" w:eastAsia="Arial" w:hAnsi="Arial" w:cs="Arial"/>
+                <w:b/>
+                <w:sz w:val="24"/>
+                <w:szCs w:val="24"/>
+              </w:rPr>
+              <w:t xml:space="preserve">  - TURNO: </w:t>
+            </w:r>
           </w:p>
-        </w:tc>
-        <w:tc>
-          <w:tcPr>
-            <w:tcW w:w="5244" w:type="dxa"/>
-          </w:tcPr>
           <w:p>
             <w:pPr>
               <w:pStyle w:val="TableParagraph"/>
@@ -540,7 +547,7 @@
         <w:tc>
           <w:tcPr>
             <w:tcW w:w="9993" w:type="dxa"/>
-            <w:gridSpan w:val="2"/>
+            <w:gridSpan w:val="4"/>
           </w:tcPr>
           <w:p>
             <w:pPr>
@@ -570,7 +577,7 @@
         <w:tc>
           <w:tcPr>
             <w:tcW w:w="9993" w:type="dxa"/>
-            <w:gridSpan w:val="2"/>
+            <w:gridSpan w:val="4"/>
             <w:shd w:val="clear" w:color="auto" w:fill="EEECE1" w:themeFill="background2"/>
           </w:tcPr>
           <w:p>
@@ -604,7 +611,7 @@
         <w:tc>
           <w:tcPr>
             <w:tcW w:w="9993" w:type="dxa"/>
-            <w:gridSpan w:val="2"/>
+            <w:gridSpan w:val="4"/>
             <w:vAlign w:val="bottom"/>
           </w:tcPr>
           <w:p>
@@ -637,7 +644,8 @@
         </w:trPr>
         <w:tc>
           <w:tcPr>
-            <w:tcW w:w="4749" w:type="dxa"/>
+            <w:tcW w:w="5032" w:type="dxa"/>
+            <w:gridSpan w:val="2"/>
             <w:vAlign w:val="bottom"/>
           </w:tcPr>
           <w:p>
@@ -665,7 +673,8 @@
         </w:tc>
         <w:tc>
           <w:tcPr>
-            <w:tcW w:w="5244" w:type="dxa"/>
+            <w:tcW w:w="4961" w:type="dxa"/>
+            <w:gridSpan w:val="2"/>
             <w:vAlign w:val="bottom"/>
           </w:tcPr>
           <w:p>
@@ -698,7 +707,7 @@
         </w:trPr>
         <w:tc>
           <w:tcPr>
-            <w:tcW w:w="4749" w:type="dxa"/>
+            <w:tcW w:w="2339" w:type="dxa"/>
             <w:vAlign w:val="bottom"/>
           </w:tcPr>
           <w:p>
@@ -721,11 +730,20 @@
               </w:rPr>
               <w:t>LOTAÇÃO: CIOPS</w:t>
             </w:r>
+            <w:r>
+              <w:rPr>
+                <w:b/>
+                <w:sz w:val="24"/>
+                <w:szCs w:val="24"/>
+              </w:rPr>
+              <w:t xml:space="preserve"> </w:t>
+            </w:r>
           </w:p>
         </w:tc>
         <w:tc>
           <w:tcPr>
-            <w:tcW w:w="5244" w:type="dxa"/>
+            <w:tcW w:w="3898" w:type="dxa"/>
+            <w:gridSpan w:val="2"/>
             <w:vAlign w:val="bottom"/>
           </w:tcPr>
           <w:p>
@@ -747,35 +765,13 @@
                 <w:sz w:val="24"/>
                 <w:szCs w:val="24"/>
               </w:rPr>
-              <w:t>PLANTÃO: {</w:t>
-            </w:r>
-            <w:r>
-              <w:rPr>
-                <w:b/>
-                <w:sz w:val="24"/>
-                <w:szCs w:val="24"/>
-              </w:rPr>
-              <w:t>s_</w:t>
-            </w:r>
-            <w:r>
-              <w:rPr>
-                <w:b/>
-                <w:sz w:val="24"/>
-                <w:szCs w:val="24"/>
-              </w:rPr>
-              <w:t>plantao}</w:t>
+              <w:t>PLANTÃO: {s_plantao}</w:t>
             </w:r>
           </w:p>
         </w:tc>
-      </w:tr>
-      <w:tr>
-        <w:trPr>
-          <w:trHeight w:hRule="exact" w:val="397"/>
-        </w:trPr>
         <w:tc>
           <w:tcPr>
-            <w:tcW w:w="9993" w:type="dxa"/>
-            <w:gridSpan w:val="2"/>
+            <w:tcW w:w="3756" w:type="dxa"/>
             <w:vAlign w:val="bottom"/>
           </w:tcPr>
           <w:p>
@@ -784,6 +780,7 @@
               <w:tabs>
                 <w:tab w:val="left" w:pos="1198"/>
               </w:tabs>
+              <w:ind w:left="74"/>
               <w:rPr>
                 <w:b/>
                 <w:sz w:val="24"/>
@@ -826,14 +823,16 @@
         <w:tblLook w:val="04A0" w:firstRow="1" w:lastRow="0" w:firstColumn="1" w:lastColumn="0" w:noHBand="0" w:noVBand="1"/>
       </w:tblPr>
       <w:tblGrid>
-        <w:gridCol w:w="4749"/>
-        <w:gridCol w:w="5244"/>
+        <w:gridCol w:w="2339"/>
+        <w:gridCol w:w="2410"/>
+        <w:gridCol w:w="1417"/>
+        <w:gridCol w:w="3827"/>
       </w:tblGrid>
       <w:tr>
         <w:tc>
           <w:tcPr>
             <w:tcW w:w="9993" w:type="dxa"/>
-            <w:gridSpan w:val="2"/>
+            <w:gridSpan w:val="4"/>
             <w:shd w:val="clear" w:color="auto" w:fill="EEECE1" w:themeFill="background2"/>
           </w:tcPr>
           <w:p>
@@ -867,7 +866,7 @@
         <w:tc>
           <w:tcPr>
             <w:tcW w:w="9993" w:type="dxa"/>
-            <w:gridSpan w:val="2"/>
+            <w:gridSpan w:val="4"/>
             <w:vAlign w:val="bottom"/>
           </w:tcPr>
           <w:p>
@@ -901,6 +900,7 @@
         <w:tc>
           <w:tcPr>
             <w:tcW w:w="4749" w:type="dxa"/>
+            <w:gridSpan w:val="2"/>
             <w:vAlign w:val="bottom"/>
           </w:tcPr>
           <w:p>
@@ -929,6 +929,7 @@
         <w:tc>
           <w:tcPr>
             <w:tcW w:w="5244" w:type="dxa"/>
+            <w:gridSpan w:val="2"/>
             <w:vAlign w:val="bottom"/>
           </w:tcPr>
           <w:p>
@@ -961,7 +962,7 @@
         </w:trPr>
         <w:tc>
           <w:tcPr>
-            <w:tcW w:w="4749" w:type="dxa"/>
+            <w:tcW w:w="2339" w:type="dxa"/>
             <w:vAlign w:val="bottom"/>
           </w:tcPr>
           <w:p>
@@ -988,7 +989,8 @@
         </w:tc>
         <w:tc>
           <w:tcPr>
-            <w:tcW w:w="5244" w:type="dxa"/>
+            <w:tcW w:w="3827" w:type="dxa"/>
+            <w:gridSpan w:val="2"/>
             <w:vAlign w:val="bottom"/>
           </w:tcPr>
           <w:p>
@@ -1014,15 +1016,9 @@
             </w:r>
           </w:p>
         </w:tc>
-      </w:tr>
-      <w:tr>
-        <w:trPr>
-          <w:trHeight w:hRule="exact" w:val="397"/>
-        </w:trPr>
         <w:tc>
           <w:tcPr>
-            <w:tcW w:w="9993" w:type="dxa"/>
-            <w:gridSpan w:val="2"/>
+            <w:tcW w:w="3827" w:type="dxa"/>
             <w:vAlign w:val="bottom"/>
           </w:tcPr>
           <w:p>
@@ -1031,6 +1027,7 @@
               <w:tabs>
                 <w:tab w:val="left" w:pos="1198"/>
               </w:tabs>
+              <w:ind w:left="74"/>
               <w:rPr>
                 <w:b/>
                 <w:sz w:val="24"/>
@@ -1088,6 +1085,18 @@
     </w:p>
     <w:p>
       <w:pPr>
+        <w:pStyle w:val="Corpodetexto"/>
+        <w:spacing w:after="1"/>
+        <w:rPr>
+          <w:rFonts w:ascii="Arial" w:hAnsi="Arial" w:cs="Arial"/>
+          <w:b/>
+          <w:sz w:val="24"/>
+          <w:szCs w:val="24"/>
+        </w:rPr>
+      </w:pPr>
+    </w:p>
+    <w:p>
+      <w:pPr>
         <w:spacing w:line="274" w:lineRule="exact"/>
         <w:ind w:left="775"/>
         <w:rPr>
@@ -1201,16 +1210,21 @@
     </w:p>
     <w:p>
       <w:pPr>
-        <w:tabs>
-          <w:tab w:val="left" w:pos="5888"/>
-        </w:tabs>
-        <w:spacing w:before="94"/>
-        <w:ind w:left="775" w:right="5543"/>
-        <w:rPr>
-          <w:rFonts w:ascii="Arial" w:hAnsi="Arial"/>
-          <w:b/>
-          <w:sz w:val="18"/>
-          <w:szCs w:val="20"/>
+        <w:pStyle w:val="Corpodetexto"/>
+        <w:rPr>
+          <w:rFonts w:ascii="Arial" w:hAnsi="Arial" w:cs="Arial"/>
+          <w:sz w:val="24"/>
+          <w:szCs w:val="24"/>
+        </w:rPr>
+      </w:pPr>
+    </w:p>
+    <w:p>
+      <w:pPr>
+        <w:pStyle w:val="Corpodetexto"/>
+        <w:rPr>
+          <w:rFonts w:ascii="Arial" w:hAnsi="Arial" w:cs="Arial"/>
+          <w:sz w:val="24"/>
+          <w:szCs w:val="24"/>
         </w:rPr>
       </w:pPr>
       <w:r>
@@ -1222,7 +1236,7 @@
         <mc:AlternateContent>
           <mc:Choice Requires="wps">
             <w:drawing>
-              <wp:anchor distT="0" distB="0" distL="114300" distR="114300" simplePos="0" relativeHeight="15731712" behindDoc="0" locked="0" layoutInCell="1" allowOverlap="1" wp14:anchorId="3151F458" wp14:editId="397E4358">
+              <wp:anchor distT="0" distB="0" distL="114300" distR="114300" simplePos="0" relativeHeight="15731712" behindDoc="0" locked="0" layoutInCell="1" allowOverlap="1" wp14:anchorId="3151F458" wp14:editId="52C83139">
                 <wp:simplePos x="0" y="0"/>
                 <wp:positionH relativeFrom="page">
                   <wp:posOffset>4434840</wp:posOffset>
@@ -1463,7 +1477,7 @@
                 <v:stroke joinstyle="miter"/>
                 <v:path gradientshapeok="t" o:connecttype="rect"/>
               </v:shapetype>
-              <v:shape id="Text Box 3" o:spid="_x0000_s1026" type="#_x0000_t202" style="position:absolute;left:0;text-align:left;margin-left:349.2pt;margin-top:11.8pt;width:210pt;height:100.5pt;z-index:15731712;visibility:visible;mso-wrap-style:square;mso-width-percent:0;mso-height-percent:0;mso-wrap-distance-left:9pt;mso-wrap-distance-top:0;mso-wrap-distance-right:9pt;mso-wrap-distance-bottom:0;mso-position-horizontal:absolute;mso-position-horizontal-relative:page;mso-position-vertical:absolute;mso-position-vertical-relative:text;mso-width-percent:0;mso-height-percent:0;mso-width-relative:page;mso-height-relative:page;v-text-anchor:top" o:gfxdata="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" filled="f" strokeweight=".5pt">
+              <v:shape id="Text Box 3" o:spid="_x0000_s1026" type="#_x0000_t202" style="position:absolute;margin-left:349.2pt;margin-top:11.8pt;width:210pt;height:100.5pt;z-index:15731712;visibility:visible;mso-wrap-style:square;mso-width-percent:0;mso-height-percent:0;mso-wrap-distance-left:9pt;mso-wrap-distance-top:0;mso-wrap-distance-right:9pt;mso-wrap-distance-bottom:0;mso-position-horizontal:absolute;mso-position-horizontal-relative:page;mso-position-vertical:absolute;mso-position-vertical-relative:text;mso-width-percent:0;mso-height-percent:0;mso-width-relative:page;mso-height-relative:page;v-text-anchor:top" o:gfxdata="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" filled="f" strokeweight=".5pt">
                 <v:textbox inset="0,0,0,0">
                   <w:txbxContent>
                     <w:p>
@@ -1642,172 +1656,183 @@
           </mc:Fallback>
         </mc:AlternateContent>
       </w:r>
-      <w:r>
-        <w:rPr>
-          <w:rFonts w:ascii="Arial" w:hAnsi="Arial"/>
-          <w:b/>
-          <w:sz w:val="18"/>
-          <w:szCs w:val="20"/>
-          <w:u w:val="single"/>
-        </w:rPr>
-        <w:t xml:space="preserve"> </w:t>
-      </w:r>
-      <w:r>
-        <w:rPr>
-          <w:rFonts w:ascii="Arial" w:hAnsi="Arial"/>
-          <w:b/>
-          <w:sz w:val="18"/>
-          <w:szCs w:val="20"/>
-          <w:u w:val="single"/>
-        </w:rPr>
-        <w:tab/>
-      </w:r>
-      <w:r>
-        <w:rPr>
-          <w:rFonts w:ascii="Arial" w:hAnsi="Arial"/>
-          <w:b/>
-          <w:spacing w:val="-1"/>
-          <w:sz w:val="18"/>
-          <w:szCs w:val="20"/>
-        </w:rPr>
-        <w:t>_</w:t>
-      </w:r>
-      <w:r>
-        <w:rPr>
-          <w:rFonts w:ascii="Arial" w:hAnsi="Arial"/>
-          <w:b/>
-          <w:spacing w:val="-53"/>
-          <w:sz w:val="18"/>
-          <w:szCs w:val="20"/>
-        </w:rPr>
-        <w:t xml:space="preserve"> </w:t>
-      </w:r>
-      <w:r>
-        <w:rPr>
-          <w:rFonts w:ascii="Arial" w:hAnsi="Arial"/>
-          <w:b/>
-          <w:sz w:val="18"/>
-          <w:szCs w:val="20"/>
-        </w:rPr>
-        <w:t>ASSINATURA</w:t>
-      </w:r>
-      <w:r>
-        <w:rPr>
-          <w:rFonts w:ascii="Arial" w:hAnsi="Arial"/>
-          <w:b/>
-          <w:spacing w:val="-2"/>
-          <w:sz w:val="18"/>
-          <w:szCs w:val="20"/>
-        </w:rPr>
-        <w:t xml:space="preserve"> </w:t>
-      </w:r>
-      <w:r>
-        <w:rPr>
-          <w:rFonts w:ascii="Arial" w:hAnsi="Arial"/>
-          <w:b/>
-          <w:sz w:val="18"/>
-          <w:szCs w:val="20"/>
-        </w:rPr>
-        <w:t>DO</w:t>
-      </w:r>
-      <w:r>
-        <w:rPr>
-          <w:rFonts w:ascii="Arial" w:hAnsi="Arial"/>
-          <w:b/>
-          <w:spacing w:val="-3"/>
-          <w:sz w:val="18"/>
-          <w:szCs w:val="20"/>
-        </w:rPr>
-        <w:t xml:space="preserve"> </w:t>
-      </w:r>
-      <w:r>
-        <w:rPr>
-          <w:rFonts w:ascii="Arial" w:hAnsi="Arial"/>
-          <w:b/>
-          <w:sz w:val="18"/>
-          <w:szCs w:val="20"/>
-        </w:rPr>
-        <w:t>REQUERENTE A</w:t>
-      </w:r>
-      <w:r>
-        <w:rPr>
-          <w:rFonts w:ascii="Arial" w:hAnsi="Arial"/>
-          <w:b/>
-          <w:spacing w:val="-3"/>
-          <w:sz w:val="18"/>
-          <w:szCs w:val="20"/>
-        </w:rPr>
-        <w:t xml:space="preserve"> </w:t>
-      </w:r>
-      <w:r>
-        <w:rPr>
-          <w:rFonts w:ascii="Arial" w:hAnsi="Arial"/>
-          <w:b/>
-          <w:sz w:val="18"/>
-          <w:szCs w:val="20"/>
-        </w:rPr>
-        <w:t>SER</w:t>
-      </w:r>
-      <w:r>
-        <w:rPr>
-          <w:rFonts w:ascii="Arial" w:hAnsi="Arial"/>
-          <w:b/>
-          <w:spacing w:val="-7"/>
-          <w:sz w:val="18"/>
-          <w:szCs w:val="20"/>
-        </w:rPr>
-        <w:t xml:space="preserve"> </w:t>
-      </w:r>
-      <w:r>
-        <w:rPr>
-          <w:rFonts w:ascii="Arial" w:hAnsi="Arial"/>
-          <w:b/>
-          <w:sz w:val="18"/>
-          <w:szCs w:val="20"/>
-        </w:rPr>
-        <w:t>SUBSTITUÍDO</w:t>
-      </w:r>
-    </w:p>
-    <w:p>
-      <w:pPr>
-        <w:pStyle w:val="Corpodetexto"/>
-        <w:rPr>
-          <w:rFonts w:ascii="Arial"/>
-          <w:b/>
-          <w:sz w:val="18"/>
-          <w:szCs w:val="20"/>
-        </w:rPr>
-      </w:pPr>
-    </w:p>
-    <w:p>
-      <w:pPr>
-        <w:pStyle w:val="Corpodetexto"/>
-        <w:rPr>
-          <w:rFonts w:ascii="Arial"/>
-          <w:b/>
-          <w:sz w:val="18"/>
-          <w:szCs w:val="20"/>
-        </w:rPr>
-      </w:pPr>
-    </w:p>
-    <w:p>
-      <w:pPr>
-        <w:pStyle w:val="Corpodetexto"/>
-        <w:rPr>
-          <w:rFonts w:ascii="Arial"/>
-          <w:b/>
-          <w:sz w:val="18"/>
-          <w:szCs w:val="20"/>
-        </w:rPr>
-      </w:pPr>
     </w:p>
     <w:p>
       <w:pPr>
         <w:tabs>
           <w:tab w:val="left" w:pos="5888"/>
         </w:tabs>
-        <w:spacing w:before="1"/>
+        <w:spacing w:before="94"/>
         <w:ind w:left="775" w:right="5543"/>
+        <w:rPr>
+          <w:rFonts w:ascii="Arial" w:hAnsi="Arial"/>
+          <w:b/>
+          <w:sz w:val="18"/>
+          <w:szCs w:val="20"/>
+        </w:rPr>
+      </w:pPr>
+      <w:r>
+        <w:rPr>
+          <w:rFonts w:ascii="Arial" w:hAnsi="Arial"/>
+          <w:b/>
+          <w:sz w:val="18"/>
+          <w:szCs w:val="20"/>
+          <w:u w:val="single"/>
+        </w:rPr>
+        <w:t xml:space="preserve"> </w:t>
+      </w:r>
+      <w:r>
+        <w:rPr>
+          <w:rFonts w:ascii="Arial" w:hAnsi="Arial"/>
+          <w:b/>
+          <w:sz w:val="18"/>
+          <w:szCs w:val="20"/>
+          <w:u w:val="single"/>
+        </w:rPr>
+        <w:tab/>
+      </w:r>
+      <w:r>
+        <w:rPr>
+          <w:rFonts w:ascii="Arial" w:hAnsi="Arial"/>
+          <w:b/>
+          <w:spacing w:val="-1"/>
+          <w:sz w:val="18"/>
+          <w:szCs w:val="20"/>
+        </w:rPr>
+        <w:t>_</w:t>
+      </w:r>
+      <w:r>
+        <w:rPr>
+          <w:rFonts w:ascii="Arial" w:hAnsi="Arial"/>
+          <w:b/>
+          <w:spacing w:val="-53"/>
+          <w:sz w:val="18"/>
+          <w:szCs w:val="20"/>
+        </w:rPr>
+        <w:t xml:space="preserve"> </w:t>
+      </w:r>
+      <w:r>
+        <w:rPr>
+          <w:rFonts w:ascii="Arial" w:hAnsi="Arial"/>
+          <w:b/>
+          <w:sz w:val="18"/>
+          <w:szCs w:val="20"/>
+        </w:rPr>
+        <w:t>ASSINATURA</w:t>
+      </w:r>
+      <w:r>
+        <w:rPr>
+          <w:rFonts w:ascii="Arial" w:hAnsi="Arial"/>
+          <w:b/>
+          <w:spacing w:val="-2"/>
+          <w:sz w:val="18"/>
+          <w:szCs w:val="20"/>
+        </w:rPr>
+        <w:t xml:space="preserve"> </w:t>
+      </w:r>
+      <w:r>
+        <w:rPr>
+          <w:rFonts w:ascii="Arial" w:hAnsi="Arial"/>
+          <w:b/>
+          <w:sz w:val="18"/>
+          <w:szCs w:val="20"/>
+        </w:rPr>
+        <w:t>DO</w:t>
+      </w:r>
+      <w:r>
+        <w:rPr>
+          <w:rFonts w:ascii="Arial" w:hAnsi="Arial"/>
+          <w:b/>
+          <w:spacing w:val="-3"/>
+          <w:sz w:val="18"/>
+          <w:szCs w:val="20"/>
+        </w:rPr>
+        <w:t xml:space="preserve"> </w:t>
+      </w:r>
+      <w:r>
+        <w:rPr>
+          <w:rFonts w:ascii="Arial" w:hAnsi="Arial"/>
+          <w:b/>
+          <w:sz w:val="18"/>
+          <w:szCs w:val="20"/>
+        </w:rPr>
+        <w:t>REQUERENTE A</w:t>
+      </w:r>
+      <w:r>
+        <w:rPr>
+          <w:rFonts w:ascii="Arial" w:hAnsi="Arial"/>
+          <w:b/>
+          <w:spacing w:val="-3"/>
+          <w:sz w:val="18"/>
+          <w:szCs w:val="20"/>
+        </w:rPr>
+        <w:t xml:space="preserve"> </w:t>
+      </w:r>
+      <w:r>
+        <w:rPr>
+          <w:rFonts w:ascii="Arial" w:hAnsi="Arial"/>
+          <w:b/>
+          <w:sz w:val="18"/>
+          <w:szCs w:val="20"/>
+        </w:rPr>
+        <w:t>SER</w:t>
+      </w:r>
+      <w:r>
+        <w:rPr>
+          <w:rFonts w:ascii="Arial" w:hAnsi="Arial"/>
+          <w:b/>
+          <w:spacing w:val="-7"/>
+          <w:sz w:val="18"/>
+          <w:szCs w:val="20"/>
+        </w:rPr>
+        <w:t xml:space="preserve"> </w:t>
+      </w:r>
+      <w:r>
+        <w:rPr>
+          <w:rFonts w:ascii="Arial" w:hAnsi="Arial"/>
+          <w:b/>
+          <w:sz w:val="18"/>
+          <w:szCs w:val="20"/>
+        </w:rPr>
+        <w:t>SUBSTITUÍDO</w:t>
+      </w:r>
+    </w:p>
+    <w:p>
+      <w:pPr>
+        <w:pStyle w:val="Corpodetexto"/>
+        <w:rPr>
+          <w:rFonts w:ascii="Arial"/>
+          <w:b/>
+          <w:sz w:val="18"/>
+          <w:szCs w:val="20"/>
+        </w:rPr>
+      </w:pPr>
+    </w:p>
+    <w:p>
+      <w:pPr>
+        <w:pStyle w:val="Corpodetexto"/>
+        <w:rPr>
+          <w:rFonts w:ascii="Arial"/>
+          <w:b/>
+          <w:sz w:val="18"/>
+          <w:szCs w:val="20"/>
+        </w:rPr>
+      </w:pPr>
+    </w:p>
+    <w:p>
+      <w:pPr>
+        <w:pStyle w:val="Corpodetexto"/>
+        <w:rPr>
+          <w:rFonts w:ascii="Arial"/>
+          <w:b/>
+          <w:sz w:val="18"/>
+          <w:szCs w:val="20"/>
+        </w:rPr>
+      </w:pPr>
+    </w:p>
+    <w:p>
+      <w:pPr>
+        <w:pStyle w:val="Corpodetexto"/>
         <w:rPr>
           <w:rFonts w:ascii="Arial"/>
           <w:b/>
@@ -1825,13 +1850,13 @@
         <mc:AlternateContent>
           <mc:Choice Requires="wps">
             <w:drawing>
-              <wp:anchor distT="0" distB="0" distL="114300" distR="114300" simplePos="0" relativeHeight="251659264" behindDoc="0" locked="0" layoutInCell="1" allowOverlap="1" wp14:anchorId="247E97A1" wp14:editId="2F5D3F40">
+              <wp:anchor distT="0" distB="0" distL="114300" distR="114300" simplePos="0" relativeHeight="251659264" behindDoc="0" locked="0" layoutInCell="1" allowOverlap="1" wp14:anchorId="247E97A1" wp14:editId="7CF76D0A">
                 <wp:simplePos x="0" y="0"/>
                 <wp:positionH relativeFrom="column">
-                  <wp:posOffset>4328160</wp:posOffset>
+                  <wp:posOffset>4343400</wp:posOffset>
                 </wp:positionH>
                 <wp:positionV relativeFrom="paragraph">
-                  <wp:posOffset>204470</wp:posOffset>
+                  <wp:posOffset>31115</wp:posOffset>
                 </wp:positionV>
                 <wp:extent cx="2446020" cy="0"/>
                 <wp:effectExtent l="38100" t="38100" r="68580" b="95250"/>
@@ -1875,13 +1900,28 @@
           </mc:Choice>
           <mc:Fallback>
             <w:pict>
-              <v:line w14:anchorId="519285F4" id="Conector reto 1" o:spid="_x0000_s1026" style="position:absolute;z-index:251659264;visibility:visible;mso-wrap-style:square;mso-wrap-distance-left:9pt;mso-wrap-distance-top:0;mso-wrap-distance-right:9pt;mso-wrap-distance-bottom:0;mso-position-horizontal:absolute;mso-position-horizontal-relative:text;mso-position-vertical:absolute;mso-position-vertical-relative:text" from="340.8pt,16.1pt" to="533.4pt,16.1pt" o:gfxdata="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" strokecolor="black [3200]" strokeweight="2pt">
+              <v:line w14:anchorId="1045A7CE" id="Conector reto 1" o:spid="_x0000_s1026" style="position:absolute;z-index:251659264;visibility:visible;mso-wrap-style:square;mso-wrap-distance-left:9pt;mso-wrap-distance-top:0;mso-wrap-distance-right:9pt;mso-wrap-distance-bottom:0;mso-position-horizontal:absolute;mso-position-horizontal-relative:text;mso-position-vertical:absolute;mso-position-vertical-relative:text" from="342pt,2.45pt" to="534.6pt,2.45pt" o:gfxdata="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" strokecolor="black [3200]" strokeweight="2pt">
                 <v:shadow on="t" color="black" opacity="24903f" origin=",.5" offset="0,.55556mm"/>
               </v:line>
             </w:pict>
           </mc:Fallback>
         </mc:AlternateContent>
       </w:r>
+    </w:p>
+    <w:p>
+      <w:pPr>
+        <w:tabs>
+          <w:tab w:val="left" w:pos="5888"/>
+        </w:tabs>
+        <w:spacing w:before="1"/>
+        <w:ind w:left="775" w:right="5543"/>
+        <w:rPr>
+          <w:rFonts w:ascii="Arial"/>
+          <w:b/>
+          <w:sz w:val="18"/>
+          <w:szCs w:val="20"/>
+        </w:rPr>
+      </w:pPr>
       <w:r>
         <w:rPr>
           <w:rFonts w:ascii="Arial"/>
@@ -2013,472 +2053,24 @@
     </w:p>
     <w:p>
       <w:pPr>
-        <w:ind w:left="775" w:right="5454"/>
-        <w:rPr>
-          <w:rFonts w:ascii="Arial" w:hAnsi="Arial"/>
-          <w:b/>
-          <w:i/>
-          <w:sz w:val="16"/>
-          <w:szCs w:val="18"/>
+        <w:ind w:left="775" w:right="635"/>
+        <w:rPr>
+          <w:rFonts w:ascii="Arial" w:hAnsi="Arial"/>
+          <w:b/>
+          <w:i/>
+          <w:sz w:val="20"/>
+          <w:u w:val="single"/>
         </w:rPr>
       </w:pPr>
-      <w:r>
-        <w:rPr>
-          <w:rFonts w:ascii="Arial" w:hAnsi="Arial"/>
-          <w:b/>
-          <w:i/>
-          <w:sz w:val="16"/>
-          <w:szCs w:val="18"/>
-          <w:u w:val="single"/>
-        </w:rPr>
-        <w:t>OBS1:</w:t>
-      </w:r>
-      <w:r>
-        <w:rPr>
-          <w:rFonts w:ascii="Arial" w:hAnsi="Arial"/>
-          <w:b/>
-          <w:i/>
-          <w:spacing w:val="24"/>
-          <w:sz w:val="16"/>
-          <w:szCs w:val="18"/>
-          <w:u w:val="single"/>
-        </w:rPr>
-        <w:t xml:space="preserve"> </w:t>
-      </w:r>
-      <w:r>
-        <w:rPr>
-          <w:rFonts w:ascii="Arial" w:hAnsi="Arial"/>
-          <w:b/>
-          <w:i/>
-          <w:sz w:val="16"/>
-          <w:szCs w:val="18"/>
-          <w:u w:val="single"/>
-        </w:rPr>
-        <w:t>PEDIDOS</w:t>
-      </w:r>
-      <w:r>
-        <w:rPr>
-          <w:rFonts w:ascii="Arial" w:hAnsi="Arial"/>
-          <w:b/>
-          <w:i/>
-          <w:spacing w:val="28"/>
-          <w:sz w:val="16"/>
-          <w:szCs w:val="18"/>
-          <w:u w:val="single"/>
-        </w:rPr>
-        <w:t xml:space="preserve"> </w:t>
-      </w:r>
-      <w:r>
-        <w:rPr>
-          <w:rFonts w:ascii="Arial" w:hAnsi="Arial"/>
-          <w:b/>
-          <w:i/>
-          <w:sz w:val="16"/>
-          <w:szCs w:val="18"/>
-          <w:u w:val="single"/>
-        </w:rPr>
-        <w:t>DE</w:t>
-      </w:r>
-      <w:r>
-        <w:rPr>
-          <w:rFonts w:ascii="Arial" w:hAnsi="Arial"/>
-          <w:b/>
-          <w:i/>
-          <w:spacing w:val="28"/>
-          <w:sz w:val="16"/>
-          <w:szCs w:val="18"/>
-          <w:u w:val="single"/>
-        </w:rPr>
-        <w:t xml:space="preserve"> </w:t>
-      </w:r>
-      <w:r>
-        <w:rPr>
-          <w:rFonts w:ascii="Arial" w:hAnsi="Arial"/>
-          <w:b/>
-          <w:i/>
-          <w:sz w:val="16"/>
-          <w:szCs w:val="18"/>
-          <w:u w:val="single"/>
-        </w:rPr>
-        <w:t>PERMUTA</w:t>
-      </w:r>
-      <w:r>
-        <w:rPr>
-          <w:rFonts w:ascii="Arial" w:hAnsi="Arial"/>
-          <w:b/>
-          <w:i/>
-          <w:spacing w:val="27"/>
-          <w:sz w:val="16"/>
-          <w:szCs w:val="18"/>
-          <w:u w:val="single"/>
-        </w:rPr>
-        <w:t xml:space="preserve"> </w:t>
-      </w:r>
-      <w:r>
-        <w:rPr>
-          <w:rFonts w:ascii="Arial" w:hAnsi="Arial"/>
-          <w:b/>
-          <w:i/>
-          <w:sz w:val="16"/>
-          <w:szCs w:val="18"/>
-          <w:u w:val="single"/>
-        </w:rPr>
-        <w:t>DE</w:t>
-      </w:r>
-      <w:r>
-        <w:rPr>
-          <w:rFonts w:ascii="Arial" w:hAnsi="Arial"/>
-          <w:b/>
-          <w:i/>
-          <w:spacing w:val="22"/>
-          <w:sz w:val="16"/>
-          <w:szCs w:val="18"/>
-          <w:u w:val="single"/>
-        </w:rPr>
-        <w:t xml:space="preserve"> </w:t>
-      </w:r>
-      <w:r>
-        <w:rPr>
-          <w:rFonts w:ascii="Arial" w:hAnsi="Arial"/>
-          <w:b/>
-          <w:i/>
-          <w:sz w:val="16"/>
-          <w:szCs w:val="18"/>
-          <w:u w:val="single"/>
-        </w:rPr>
-        <w:t>PLANTÃO</w:t>
-      </w:r>
-      <w:r>
-        <w:rPr>
-          <w:rFonts w:ascii="Arial" w:hAnsi="Arial"/>
-          <w:b/>
-          <w:i/>
-          <w:spacing w:val="26"/>
-          <w:sz w:val="16"/>
-          <w:szCs w:val="18"/>
-          <w:u w:val="single"/>
-        </w:rPr>
-        <w:t xml:space="preserve"> </w:t>
-      </w:r>
-      <w:r>
-        <w:rPr>
-          <w:rFonts w:ascii="Arial" w:hAnsi="Arial"/>
-          <w:b/>
-          <w:i/>
-          <w:sz w:val="16"/>
-          <w:szCs w:val="18"/>
-          <w:u w:val="single"/>
-        </w:rPr>
-        <w:t>DEVERÃO</w:t>
-      </w:r>
-      <w:r>
-        <w:rPr>
-          <w:rFonts w:ascii="Arial" w:hAnsi="Arial"/>
-          <w:b/>
-          <w:i/>
-          <w:spacing w:val="26"/>
-          <w:sz w:val="16"/>
-          <w:szCs w:val="18"/>
-          <w:u w:val="single"/>
-        </w:rPr>
-        <w:t xml:space="preserve"> </w:t>
-      </w:r>
-      <w:r>
-        <w:rPr>
-          <w:rFonts w:ascii="Arial" w:hAnsi="Arial"/>
-          <w:b/>
-          <w:i/>
-          <w:sz w:val="16"/>
-          <w:szCs w:val="18"/>
-          <w:u w:val="single"/>
-        </w:rPr>
-        <w:t>SER</w:t>
-      </w:r>
-      <w:r>
-        <w:rPr>
-          <w:rFonts w:ascii="Arial" w:hAnsi="Arial"/>
-          <w:b/>
-          <w:i/>
-          <w:spacing w:val="22"/>
-          <w:sz w:val="16"/>
-          <w:szCs w:val="18"/>
-          <w:u w:val="single"/>
-        </w:rPr>
-        <w:t xml:space="preserve"> </w:t>
-      </w:r>
-      <w:r>
-        <w:rPr>
-          <w:rFonts w:ascii="Arial" w:hAnsi="Arial"/>
-          <w:b/>
-          <w:i/>
-          <w:sz w:val="16"/>
-          <w:szCs w:val="18"/>
-          <w:u w:val="single"/>
-        </w:rPr>
-        <w:t>FEITOS</w:t>
-      </w:r>
-      <w:r>
-        <w:rPr>
-          <w:rFonts w:ascii="Arial" w:hAnsi="Arial"/>
-          <w:b/>
-          <w:i/>
-          <w:spacing w:val="28"/>
-          <w:sz w:val="16"/>
-          <w:szCs w:val="18"/>
-          <w:u w:val="single"/>
-        </w:rPr>
-        <w:t xml:space="preserve"> </w:t>
-      </w:r>
-      <w:r>
-        <w:rPr>
-          <w:rFonts w:ascii="Arial" w:hAnsi="Arial"/>
-          <w:b/>
-          <w:i/>
-          <w:sz w:val="16"/>
-          <w:szCs w:val="18"/>
-          <w:u w:val="single"/>
-        </w:rPr>
-        <w:t>NO</w:t>
-      </w:r>
-      <w:r>
-        <w:rPr>
-          <w:rFonts w:ascii="Arial" w:hAnsi="Arial"/>
-          <w:b/>
-          <w:i/>
-          <w:spacing w:val="35"/>
-          <w:sz w:val="16"/>
-          <w:szCs w:val="18"/>
-          <w:u w:val="single"/>
-        </w:rPr>
-        <w:t xml:space="preserve"> </w:t>
-      </w:r>
-      <w:r>
-        <w:rPr>
-          <w:rFonts w:ascii="Arial" w:hAnsi="Arial"/>
-          <w:b/>
-          <w:i/>
-          <w:sz w:val="16"/>
-          <w:szCs w:val="18"/>
-          <w:u w:val="single"/>
-        </w:rPr>
-        <w:t>PRÁZO</w:t>
-      </w:r>
-      <w:r>
-        <w:rPr>
-          <w:rFonts w:ascii="Arial" w:hAnsi="Arial"/>
-          <w:b/>
-          <w:i/>
-          <w:spacing w:val="26"/>
-          <w:sz w:val="16"/>
-          <w:szCs w:val="18"/>
-          <w:u w:val="single"/>
-        </w:rPr>
-        <w:t xml:space="preserve"> </w:t>
-      </w:r>
-      <w:r>
-        <w:rPr>
-          <w:rFonts w:ascii="Arial" w:hAnsi="Arial"/>
-          <w:b/>
-          <w:i/>
-          <w:sz w:val="16"/>
-          <w:szCs w:val="18"/>
-          <w:u w:val="single"/>
-        </w:rPr>
-        <w:t>MÍNIMO</w:t>
-      </w:r>
-      <w:r>
-        <w:rPr>
-          <w:rFonts w:ascii="Arial" w:hAnsi="Arial"/>
-          <w:b/>
-          <w:i/>
-          <w:spacing w:val="26"/>
-          <w:sz w:val="16"/>
-          <w:szCs w:val="18"/>
-          <w:u w:val="single"/>
-        </w:rPr>
-        <w:t xml:space="preserve"> </w:t>
-      </w:r>
-      <w:r>
-        <w:rPr>
-          <w:rFonts w:ascii="Arial" w:hAnsi="Arial"/>
-          <w:b/>
-          <w:i/>
-          <w:sz w:val="16"/>
-          <w:szCs w:val="18"/>
-          <w:u w:val="single"/>
-        </w:rPr>
-        <w:t>DE</w:t>
-      </w:r>
-      <w:r>
-        <w:rPr>
-          <w:rFonts w:ascii="Arial" w:hAnsi="Arial"/>
-          <w:b/>
-          <w:i/>
-          <w:spacing w:val="27"/>
-          <w:sz w:val="16"/>
-          <w:szCs w:val="18"/>
-          <w:u w:val="single"/>
-        </w:rPr>
-        <w:t xml:space="preserve"> </w:t>
-      </w:r>
-      <w:r>
-        <w:rPr>
-          <w:rFonts w:ascii="Arial" w:hAnsi="Arial"/>
-          <w:b/>
-          <w:i/>
-          <w:sz w:val="16"/>
-          <w:szCs w:val="18"/>
-          <w:u w:val="single"/>
-        </w:rPr>
-        <w:t>2</w:t>
-      </w:r>
-      <w:r>
-        <w:rPr>
-          <w:rFonts w:ascii="Arial" w:hAnsi="Arial"/>
-          <w:b/>
-          <w:i/>
-          <w:spacing w:val="21"/>
-          <w:sz w:val="16"/>
-          <w:szCs w:val="18"/>
-          <w:u w:val="single"/>
-        </w:rPr>
-        <w:t xml:space="preserve"> </w:t>
-      </w:r>
-      <w:r>
-        <w:rPr>
-          <w:rFonts w:ascii="Arial" w:hAnsi="Arial"/>
-          <w:b/>
-          <w:i/>
-          <w:sz w:val="16"/>
-          <w:szCs w:val="18"/>
-          <w:u w:val="single"/>
-        </w:rPr>
-        <w:t>DIAS</w:t>
-      </w:r>
-      <w:r>
-        <w:rPr>
-          <w:rFonts w:ascii="Arial" w:hAnsi="Arial"/>
-          <w:b/>
-          <w:i/>
-          <w:spacing w:val="-53"/>
-          <w:sz w:val="16"/>
-          <w:szCs w:val="18"/>
-        </w:rPr>
-        <w:t xml:space="preserve"> </w:t>
-      </w:r>
-      <w:r>
-        <w:rPr>
-          <w:rFonts w:ascii="Arial" w:hAnsi="Arial"/>
-          <w:b/>
-          <w:i/>
-          <w:sz w:val="16"/>
-          <w:szCs w:val="18"/>
-          <w:u w:val="single"/>
-        </w:rPr>
-        <w:t>ÚTEIS</w:t>
-      </w:r>
-      <w:r>
-        <w:rPr>
-          <w:rFonts w:ascii="Arial" w:hAnsi="Arial"/>
-          <w:b/>
-          <w:i/>
-          <w:spacing w:val="-1"/>
-          <w:sz w:val="16"/>
-          <w:szCs w:val="18"/>
-          <w:u w:val="single"/>
-        </w:rPr>
-        <w:t xml:space="preserve"> </w:t>
-      </w:r>
-      <w:r>
-        <w:rPr>
-          <w:rFonts w:ascii="Arial" w:hAnsi="Arial"/>
-          <w:b/>
-          <w:i/>
-          <w:sz w:val="16"/>
-          <w:szCs w:val="18"/>
-          <w:u w:val="single"/>
-        </w:rPr>
-        <w:t>DE</w:t>
-      </w:r>
-      <w:r>
-        <w:rPr>
-          <w:rFonts w:ascii="Arial" w:hAnsi="Arial"/>
-          <w:b/>
-          <w:i/>
-          <w:spacing w:val="1"/>
-          <w:sz w:val="16"/>
-          <w:szCs w:val="18"/>
-          <w:u w:val="single"/>
-        </w:rPr>
-        <w:t xml:space="preserve"> </w:t>
-      </w:r>
-      <w:r>
-        <w:rPr>
-          <w:rFonts w:ascii="Arial" w:hAnsi="Arial"/>
-          <w:b/>
-          <w:i/>
-          <w:sz w:val="16"/>
-          <w:szCs w:val="18"/>
-          <w:u w:val="single"/>
-        </w:rPr>
-        <w:t>ANTECEDÊNCIA</w:t>
-      </w:r>
-      <w:r>
-        <w:rPr>
-          <w:rFonts w:ascii="Arial" w:hAnsi="Arial"/>
-          <w:b/>
-          <w:i/>
-          <w:spacing w:val="-1"/>
-          <w:sz w:val="16"/>
-          <w:szCs w:val="18"/>
-          <w:u w:val="single"/>
-        </w:rPr>
-        <w:t xml:space="preserve"> </w:t>
-      </w:r>
-      <w:r>
-        <w:rPr>
-          <w:rFonts w:ascii="Arial" w:hAnsi="Arial"/>
-          <w:b/>
-          <w:i/>
-          <w:sz w:val="16"/>
-          <w:szCs w:val="18"/>
-          <w:u w:val="single"/>
-        </w:rPr>
-        <w:t>A DATA DO</w:t>
-      </w:r>
-      <w:r>
-        <w:rPr>
-          <w:rFonts w:ascii="Arial" w:hAnsi="Arial"/>
-          <w:b/>
-          <w:i/>
-          <w:spacing w:val="-2"/>
-          <w:sz w:val="16"/>
-          <w:szCs w:val="18"/>
-          <w:u w:val="single"/>
-        </w:rPr>
-        <w:t xml:space="preserve"> </w:t>
-      </w:r>
-      <w:r>
-        <w:rPr>
-          <w:rFonts w:ascii="Arial" w:hAnsi="Arial"/>
-          <w:b/>
-          <w:i/>
-          <w:sz w:val="16"/>
-          <w:szCs w:val="18"/>
-          <w:u w:val="single"/>
-        </w:rPr>
-        <w:t>PLANTÃO.</w:t>
-      </w:r>
     </w:p>
     <w:p>
       <w:pPr>
-        <w:ind w:left="775" w:right="5454"/>
-        <w:rPr>
-          <w:rFonts w:ascii="Arial" w:hAnsi="Arial"/>
-          <w:b/>
-          <w:i/>
-          <w:sz w:val="16"/>
-          <w:szCs w:val="18"/>
+        <w:ind w:left="775" w:right="635"/>
+        <w:rPr>
+          <w:rFonts w:ascii="Arial" w:hAnsi="Arial"/>
+          <w:b/>
+          <w:i/>
+          <w:sz w:val="20"/>
         </w:rPr>
       </w:pPr>
       <w:r>
@@ -2486,8 +2078,426 @@
           <w:rFonts w:ascii="Arial" w:hAnsi="Arial"/>
           <w:b/>
           <w:i/>
-          <w:sz w:val="16"/>
-          <w:szCs w:val="18"/>
+          <w:sz w:val="20"/>
+          <w:u w:val="single"/>
+        </w:rPr>
+        <w:t>OBS1:</w:t>
+      </w:r>
+      <w:r>
+        <w:rPr>
+          <w:rFonts w:ascii="Arial" w:hAnsi="Arial"/>
+          <w:b/>
+          <w:i/>
+          <w:spacing w:val="24"/>
+          <w:sz w:val="20"/>
+          <w:u w:val="single"/>
+        </w:rPr>
+        <w:t xml:space="preserve"> </w:t>
+      </w:r>
+      <w:r>
+        <w:rPr>
+          <w:rFonts w:ascii="Arial" w:hAnsi="Arial"/>
+          <w:b/>
+          <w:i/>
+          <w:sz w:val="20"/>
+          <w:u w:val="single"/>
+        </w:rPr>
+        <w:t>PEDIDOS</w:t>
+      </w:r>
+      <w:r>
+        <w:rPr>
+          <w:rFonts w:ascii="Arial" w:hAnsi="Arial"/>
+          <w:b/>
+          <w:i/>
+          <w:spacing w:val="28"/>
+          <w:sz w:val="20"/>
+          <w:u w:val="single"/>
+        </w:rPr>
+        <w:t xml:space="preserve"> </w:t>
+      </w:r>
+      <w:r>
+        <w:rPr>
+          <w:rFonts w:ascii="Arial" w:hAnsi="Arial"/>
+          <w:b/>
+          <w:i/>
+          <w:sz w:val="20"/>
+          <w:u w:val="single"/>
+        </w:rPr>
+        <w:t>DE</w:t>
+      </w:r>
+      <w:r>
+        <w:rPr>
+          <w:rFonts w:ascii="Arial" w:hAnsi="Arial"/>
+          <w:b/>
+          <w:i/>
+          <w:spacing w:val="28"/>
+          <w:sz w:val="20"/>
+          <w:u w:val="single"/>
+        </w:rPr>
+        <w:t xml:space="preserve"> </w:t>
+      </w:r>
+      <w:r>
+        <w:rPr>
+          <w:rFonts w:ascii="Arial" w:hAnsi="Arial"/>
+          <w:b/>
+          <w:i/>
+          <w:sz w:val="20"/>
+          <w:u w:val="single"/>
+        </w:rPr>
+        <w:t>PERMUTA</w:t>
+      </w:r>
+      <w:r>
+        <w:rPr>
+          <w:rFonts w:ascii="Arial" w:hAnsi="Arial"/>
+          <w:b/>
+          <w:i/>
+          <w:spacing w:val="27"/>
+          <w:sz w:val="20"/>
+          <w:u w:val="single"/>
+        </w:rPr>
+        <w:t xml:space="preserve"> </w:t>
+      </w:r>
+      <w:r>
+        <w:rPr>
+          <w:rFonts w:ascii="Arial" w:hAnsi="Arial"/>
+          <w:b/>
+          <w:i/>
+          <w:sz w:val="20"/>
+          <w:u w:val="single"/>
+        </w:rPr>
+        <w:t>DE</w:t>
+      </w:r>
+      <w:r>
+        <w:rPr>
+          <w:rFonts w:ascii="Arial" w:hAnsi="Arial"/>
+          <w:b/>
+          <w:i/>
+          <w:spacing w:val="22"/>
+          <w:sz w:val="20"/>
+          <w:u w:val="single"/>
+        </w:rPr>
+        <w:t xml:space="preserve"> </w:t>
+      </w:r>
+      <w:r>
+        <w:rPr>
+          <w:rFonts w:ascii="Arial" w:hAnsi="Arial"/>
+          <w:b/>
+          <w:i/>
+          <w:sz w:val="20"/>
+          <w:u w:val="single"/>
+        </w:rPr>
+        <w:t>PLANTÃO</w:t>
+      </w:r>
+      <w:r>
+        <w:rPr>
+          <w:rFonts w:ascii="Arial" w:hAnsi="Arial"/>
+          <w:b/>
+          <w:i/>
+          <w:spacing w:val="26"/>
+          <w:sz w:val="20"/>
+          <w:u w:val="single"/>
+        </w:rPr>
+        <w:t xml:space="preserve"> </w:t>
+      </w:r>
+      <w:r>
+        <w:rPr>
+          <w:rFonts w:ascii="Arial" w:hAnsi="Arial"/>
+          <w:b/>
+          <w:i/>
+          <w:sz w:val="20"/>
+          <w:u w:val="single"/>
+        </w:rPr>
+        <w:t>DEVERÃO</w:t>
+      </w:r>
+      <w:r>
+        <w:rPr>
+          <w:rFonts w:ascii="Arial" w:hAnsi="Arial"/>
+          <w:b/>
+          <w:i/>
+          <w:spacing w:val="26"/>
+          <w:sz w:val="20"/>
+          <w:u w:val="single"/>
+        </w:rPr>
+        <w:t xml:space="preserve"> </w:t>
+      </w:r>
+      <w:r>
+        <w:rPr>
+          <w:rFonts w:ascii="Arial" w:hAnsi="Arial"/>
+          <w:b/>
+          <w:i/>
+          <w:sz w:val="20"/>
+          <w:u w:val="single"/>
+        </w:rPr>
+        <w:t>SER</w:t>
+      </w:r>
+      <w:r>
+        <w:rPr>
+          <w:rFonts w:ascii="Arial" w:hAnsi="Arial"/>
+          <w:b/>
+          <w:i/>
+          <w:spacing w:val="22"/>
+          <w:sz w:val="20"/>
+          <w:u w:val="single"/>
+        </w:rPr>
+        <w:t xml:space="preserve"> </w:t>
+      </w:r>
+      <w:r>
+        <w:rPr>
+          <w:rFonts w:ascii="Arial" w:hAnsi="Arial"/>
+          <w:b/>
+          <w:i/>
+          <w:sz w:val="20"/>
+          <w:u w:val="single"/>
+        </w:rPr>
+        <w:t>FEITOS</w:t>
+      </w:r>
+      <w:r>
+        <w:rPr>
+          <w:rFonts w:ascii="Arial" w:hAnsi="Arial"/>
+          <w:b/>
+          <w:i/>
+          <w:spacing w:val="28"/>
+          <w:sz w:val="20"/>
+          <w:u w:val="single"/>
+        </w:rPr>
+        <w:t xml:space="preserve"> </w:t>
+      </w:r>
+      <w:r>
+        <w:rPr>
+          <w:rFonts w:ascii="Arial" w:hAnsi="Arial"/>
+          <w:b/>
+          <w:i/>
+          <w:sz w:val="20"/>
+          <w:u w:val="single"/>
+        </w:rPr>
+        <w:t>NO</w:t>
+      </w:r>
+      <w:r>
+        <w:rPr>
+          <w:rFonts w:ascii="Arial" w:hAnsi="Arial"/>
+          <w:b/>
+          <w:i/>
+          <w:spacing w:val="35"/>
+          <w:sz w:val="20"/>
+          <w:u w:val="single"/>
+        </w:rPr>
+        <w:t xml:space="preserve"> </w:t>
+      </w:r>
+      <w:r>
+        <w:rPr>
+          <w:rFonts w:ascii="Arial" w:hAnsi="Arial"/>
+          <w:b/>
+          <w:i/>
+          <w:sz w:val="20"/>
+          <w:u w:val="single"/>
+        </w:rPr>
+        <w:t>PRÁZO</w:t>
+      </w:r>
+      <w:r>
+        <w:rPr>
+          <w:rFonts w:ascii="Arial" w:hAnsi="Arial"/>
+          <w:b/>
+          <w:i/>
+          <w:spacing w:val="26"/>
+          <w:sz w:val="20"/>
+          <w:u w:val="single"/>
+        </w:rPr>
+        <w:t xml:space="preserve"> </w:t>
+      </w:r>
+      <w:r>
+        <w:rPr>
+          <w:rFonts w:ascii="Arial" w:hAnsi="Arial"/>
+          <w:b/>
+          <w:i/>
+          <w:sz w:val="20"/>
+          <w:u w:val="single"/>
+        </w:rPr>
+        <w:t>MÍNIMO</w:t>
+      </w:r>
+      <w:r>
+        <w:rPr>
+          <w:rFonts w:ascii="Arial" w:hAnsi="Arial"/>
+          <w:b/>
+          <w:i/>
+          <w:spacing w:val="26"/>
+          <w:sz w:val="20"/>
+          <w:u w:val="single"/>
+        </w:rPr>
+        <w:t xml:space="preserve"> </w:t>
+      </w:r>
+      <w:r>
+        <w:rPr>
+          <w:rFonts w:ascii="Arial" w:hAnsi="Arial"/>
+          <w:b/>
+          <w:i/>
+          <w:sz w:val="20"/>
+          <w:u w:val="single"/>
+        </w:rPr>
+        <w:t>DE</w:t>
+      </w:r>
+      <w:r>
+        <w:rPr>
+          <w:rFonts w:ascii="Arial" w:hAnsi="Arial"/>
+          <w:b/>
+          <w:i/>
+          <w:spacing w:val="27"/>
+          <w:sz w:val="20"/>
+          <w:u w:val="single"/>
+        </w:rPr>
+        <w:t xml:space="preserve"> </w:t>
+      </w:r>
+      <w:r>
+        <w:rPr>
+          <w:rFonts w:ascii="Arial" w:hAnsi="Arial"/>
+          <w:b/>
+          <w:i/>
+          <w:sz w:val="20"/>
+          <w:u w:val="single"/>
+        </w:rPr>
+        <w:t>2</w:t>
+      </w:r>
+      <w:r>
+        <w:rPr>
+          <w:rFonts w:ascii="Arial" w:hAnsi="Arial"/>
+          <w:b/>
+          <w:i/>
+          <w:spacing w:val="21"/>
+          <w:sz w:val="20"/>
+          <w:u w:val="single"/>
+        </w:rPr>
+        <w:t xml:space="preserve"> </w:t>
+      </w:r>
+      <w:r>
+        <w:rPr>
+          <w:rFonts w:ascii="Arial" w:hAnsi="Arial"/>
+          <w:b/>
+          <w:i/>
+          <w:sz w:val="20"/>
+          <w:u w:val="single"/>
+        </w:rPr>
+        <w:t>DIAS</w:t>
+      </w:r>
+      <w:r>
+        <w:rPr>
+          <w:rFonts w:ascii="Arial" w:hAnsi="Arial"/>
+          <w:b/>
+          <w:i/>
+          <w:spacing w:val="-53"/>
+          <w:sz w:val="20"/>
+        </w:rPr>
+        <w:t xml:space="preserve"> </w:t>
+      </w:r>
+      <w:r>
+        <w:rPr>
+          <w:rFonts w:ascii="Arial" w:hAnsi="Arial"/>
+          <w:b/>
+          <w:i/>
+          <w:sz w:val="20"/>
+          <w:u w:val="single"/>
+        </w:rPr>
+        <w:t>ÚTEIS</w:t>
+      </w:r>
+      <w:r>
+        <w:rPr>
+          <w:rFonts w:ascii="Arial" w:hAnsi="Arial"/>
+          <w:b/>
+          <w:i/>
+          <w:spacing w:val="-1"/>
+          <w:sz w:val="20"/>
+          <w:u w:val="single"/>
+        </w:rPr>
+        <w:t xml:space="preserve"> </w:t>
+      </w:r>
+      <w:r>
+        <w:rPr>
+          <w:rFonts w:ascii="Arial" w:hAnsi="Arial"/>
+          <w:b/>
+          <w:i/>
+          <w:sz w:val="20"/>
+          <w:u w:val="single"/>
+        </w:rPr>
+        <w:t>DE</w:t>
+      </w:r>
+      <w:r>
+        <w:rPr>
+          <w:rFonts w:ascii="Arial" w:hAnsi="Arial"/>
+          <w:b/>
+          <w:i/>
+          <w:spacing w:val="1"/>
+          <w:sz w:val="20"/>
+          <w:u w:val="single"/>
+        </w:rPr>
+        <w:t xml:space="preserve"> </w:t>
+      </w:r>
+      <w:r>
+        <w:rPr>
+          <w:rFonts w:ascii="Arial" w:hAnsi="Arial"/>
+          <w:b/>
+          <w:i/>
+          <w:sz w:val="20"/>
+          <w:u w:val="single"/>
+        </w:rPr>
+        <w:t>ANTECEDÊNCIA</w:t>
+      </w:r>
+      <w:r>
+        <w:rPr>
+          <w:rFonts w:ascii="Arial" w:hAnsi="Arial"/>
+          <w:b/>
+          <w:i/>
+          <w:spacing w:val="-1"/>
+          <w:sz w:val="20"/>
+          <w:u w:val="single"/>
+        </w:rPr>
+        <w:t xml:space="preserve"> </w:t>
+      </w:r>
+      <w:r>
+        <w:rPr>
+          <w:rFonts w:ascii="Arial" w:hAnsi="Arial"/>
+          <w:b/>
+          <w:i/>
+          <w:sz w:val="20"/>
+          <w:u w:val="single"/>
+        </w:rPr>
+        <w:t>A DATA DO</w:t>
+      </w:r>
+      <w:r>
+        <w:rPr>
+          <w:rFonts w:ascii="Arial" w:hAnsi="Arial"/>
+          <w:b/>
+          <w:i/>
+          <w:spacing w:val="-2"/>
+          <w:sz w:val="20"/>
+          <w:u w:val="single"/>
+        </w:rPr>
+        <w:t xml:space="preserve"> </w:t>
+      </w:r>
+      <w:r>
+        <w:rPr>
+          <w:rFonts w:ascii="Arial" w:hAnsi="Arial"/>
+          <w:b/>
+          <w:i/>
+          <w:sz w:val="20"/>
+          <w:u w:val="single"/>
+        </w:rPr>
+        <w:t>PLANTÃO.</w:t>
+      </w:r>
+    </w:p>
+    <w:p>
+      <w:pPr>
+        <w:ind w:left="775" w:right="635"/>
+        <w:rPr>
+          <w:rFonts w:ascii="Arial" w:hAnsi="Arial"/>
+          <w:b/>
+          <w:i/>
+          <w:sz w:val="20"/>
+        </w:rPr>
+      </w:pPr>
+      <w:r>
+        <w:rPr>
+          <w:rFonts w:ascii="Arial" w:hAnsi="Arial"/>
+          <w:b/>
+          <w:i/>
+          <w:sz w:val="20"/>
           <w:u w:val="thick"/>
         </w:rPr>
         <w:t>OBS2:</w:t>
@@ -2498,8 +2508,7 @@
           <w:b/>
           <w:i/>
           <w:spacing w:val="-4"/>
-          <w:sz w:val="16"/>
-          <w:szCs w:val="18"/>
+          <w:sz w:val="20"/>
           <w:u w:val="thick"/>
         </w:rPr>
         <w:t xml:space="preserve"> </w:t>
@@ -2509,8 +2518,7 @@
           <w:rFonts w:ascii="Arial" w:hAnsi="Arial"/>
           <w:b/>
           <w:i/>
-          <w:sz w:val="16"/>
-          <w:szCs w:val="18"/>
+          <w:sz w:val="20"/>
           <w:u w:val="thick"/>
         </w:rPr>
         <w:t>NÃO</w:t>
@@ -2521,8 +2529,7 @@
           <w:b/>
           <w:i/>
           <w:spacing w:val="-3"/>
-          <w:sz w:val="16"/>
-          <w:szCs w:val="18"/>
+          <w:sz w:val="20"/>
           <w:u w:val="thick"/>
         </w:rPr>
         <w:t xml:space="preserve"> </w:t>
@@ -2532,8 +2539,7 @@
           <w:rFonts w:ascii="Arial" w:hAnsi="Arial"/>
           <w:b/>
           <w:i/>
-          <w:sz w:val="16"/>
-          <w:szCs w:val="18"/>
+          <w:sz w:val="20"/>
           <w:u w:val="thick"/>
         </w:rPr>
         <w:t>SERÃO</w:t>
@@ -2544,8 +2550,7 @@
           <w:b/>
           <w:i/>
           <w:spacing w:val="-3"/>
-          <w:sz w:val="16"/>
-          <w:szCs w:val="18"/>
+          <w:sz w:val="20"/>
           <w:u w:val="thick"/>
         </w:rPr>
         <w:t xml:space="preserve"> </w:t>
@@ -2555,8 +2560,7 @@
           <w:rFonts w:ascii="Arial" w:hAnsi="Arial"/>
           <w:b/>
           <w:i/>
-          <w:sz w:val="16"/>
-          <w:szCs w:val="18"/>
+          <w:sz w:val="20"/>
           <w:u w:val="thick"/>
         </w:rPr>
         <w:t>ACEITOS</w:t>
@@ -2567,8 +2571,7 @@
           <w:b/>
           <w:i/>
           <w:spacing w:val="-1"/>
-          <w:sz w:val="16"/>
-          <w:szCs w:val="18"/>
+          <w:sz w:val="20"/>
           <w:u w:val="thick"/>
         </w:rPr>
         <w:t xml:space="preserve"> </w:t>
@@ -2578,8 +2581,7 @@
           <w:rFonts w:ascii="Arial" w:hAnsi="Arial"/>
           <w:b/>
           <w:i/>
-          <w:sz w:val="16"/>
-          <w:szCs w:val="18"/>
+          <w:sz w:val="20"/>
           <w:u w:val="thick"/>
         </w:rPr>
         <w:t>PEDIDOS DE</w:t>
@@ -2590,8 +2592,7 @@
           <w:b/>
           <w:i/>
           <w:spacing w:val="-1"/>
-          <w:sz w:val="16"/>
-          <w:szCs w:val="18"/>
+          <w:sz w:val="20"/>
           <w:u w:val="thick"/>
         </w:rPr>
         <w:t xml:space="preserve"> </w:t>
@@ -2601,8 +2602,7 @@
           <w:rFonts w:ascii="Arial" w:hAnsi="Arial"/>
           <w:b/>
           <w:i/>
-          <w:sz w:val="16"/>
-          <w:szCs w:val="18"/>
+          <w:sz w:val="20"/>
           <w:u w:val="thick"/>
         </w:rPr>
         <w:t>PERMUTA</w:t>
@@ -2613,8 +2613,7 @@
           <w:b/>
           <w:i/>
           <w:spacing w:val="-2"/>
-          <w:sz w:val="16"/>
-          <w:szCs w:val="18"/>
+          <w:sz w:val="20"/>
           <w:u w:val="thick"/>
         </w:rPr>
         <w:t xml:space="preserve"> </w:t>
@@ -2624,8 +2623,7 @@
           <w:rFonts w:ascii="Arial" w:hAnsi="Arial"/>
           <w:b/>
           <w:i/>
-          <w:sz w:val="16"/>
-          <w:szCs w:val="18"/>
+          <w:sz w:val="20"/>
           <w:u w:val="thick"/>
         </w:rPr>
         <w:t>DE</w:t>
@@ -2636,8 +2634,7 @@
           <w:b/>
           <w:i/>
           <w:spacing w:val="-1"/>
-          <w:sz w:val="16"/>
-          <w:szCs w:val="18"/>
+          <w:sz w:val="20"/>
           <w:u w:val="thick"/>
         </w:rPr>
         <w:t xml:space="preserve"> </w:t>
@@ -2647,8 +2644,7 @@
           <w:rFonts w:ascii="Arial" w:hAnsi="Arial"/>
           <w:b/>
           <w:i/>
-          <w:sz w:val="16"/>
-          <w:szCs w:val="18"/>
+          <w:sz w:val="20"/>
           <w:u w:val="thick"/>
         </w:rPr>
         <w:t>PLANTÃO</w:t>
@@ -2659,8 +2655,7 @@
           <w:b/>
           <w:i/>
           <w:spacing w:val="-3"/>
-          <w:sz w:val="16"/>
-          <w:szCs w:val="18"/>
+          <w:sz w:val="20"/>
           <w:u w:val="thick"/>
         </w:rPr>
         <w:t xml:space="preserve"> </w:t>
@@ -2670,8 +2665,7 @@
           <w:rFonts w:ascii="Arial" w:hAnsi="Arial"/>
           <w:b/>
           <w:i/>
-          <w:sz w:val="16"/>
-          <w:szCs w:val="18"/>
+          <w:sz w:val="20"/>
           <w:u w:val="thick"/>
         </w:rPr>
         <w:t>ENVIADOS</w:t>
@@ -2682,8 +2676,7 @@
           <w:b/>
           <w:i/>
           <w:spacing w:val="-1"/>
-          <w:sz w:val="16"/>
-          <w:szCs w:val="18"/>
+          <w:sz w:val="20"/>
           <w:u w:val="thick"/>
         </w:rPr>
         <w:t xml:space="preserve"> </w:t>
@@ -2693,8 +2686,7 @@
           <w:rFonts w:ascii="Arial" w:hAnsi="Arial"/>
           <w:b/>
           <w:i/>
-          <w:sz w:val="16"/>
-          <w:szCs w:val="18"/>
+          <w:sz w:val="20"/>
           <w:u w:val="thick"/>
         </w:rPr>
         <w:t>POR</w:t>
@@ -2705,8 +2697,7 @@
           <w:b/>
           <w:i/>
           <w:spacing w:val="-1"/>
-          <w:sz w:val="16"/>
-          <w:szCs w:val="18"/>
+          <w:sz w:val="20"/>
           <w:u w:val="thick"/>
         </w:rPr>
         <w:t xml:space="preserve"> </w:t>
@@ -2716,8 +2707,7 @@
           <w:rFonts w:ascii="Arial" w:hAnsi="Arial"/>
           <w:b/>
           <w:i/>
-          <w:sz w:val="16"/>
-          <w:szCs w:val="18"/>
+          <w:sz w:val="20"/>
           <w:u w:val="thick"/>
         </w:rPr>
         <w:t>E-MAIL.</w:t>
@@ -2733,19 +2723,63 @@
           <w:sz w:val="20"/>
         </w:rPr>
       </w:pPr>
+    </w:p>
+    <w:p>
+      <w:pPr>
+        <w:pStyle w:val="Corpodetexto"/>
+        <w:rPr>
+          <w:rFonts w:ascii="Arial"/>
+          <w:b/>
+          <w:i/>
+          <w:sz w:val="20"/>
+        </w:rPr>
+      </w:pPr>
+    </w:p>
+    <w:p>
+      <w:pPr>
+        <w:pStyle w:val="Corpodetexto"/>
+        <w:rPr>
+          <w:rFonts w:ascii="Arial"/>
+          <w:b/>
+          <w:i/>
+          <w:sz w:val="20"/>
+        </w:rPr>
+      </w:pPr>
+    </w:p>
+    <w:p>
+      <w:pPr>
+        <w:pStyle w:val="Corpodetexto"/>
+        <w:rPr>
+          <w:rFonts w:ascii="Arial"/>
+          <w:b/>
+          <w:i/>
+          <w:sz w:val="20"/>
+        </w:rPr>
+      </w:pPr>
+    </w:p>
+    <w:p>
+      <w:pPr>
+        <w:pStyle w:val="Corpodetexto"/>
+        <w:rPr>
+          <w:rFonts w:ascii="Arial"/>
+          <w:b/>
+          <w:i/>
+          <w:sz w:val="20"/>
+        </w:rPr>
+      </w:pPr>
       <w:r>
         <w:rPr>
           <w:noProof/>
           <w:lang w:val="pt-BR" w:eastAsia="pt-BR"/>
         </w:rPr>
         <w:drawing>
-          <wp:anchor distT="0" distB="0" distL="0" distR="0" simplePos="0" relativeHeight="15729664" behindDoc="0" locked="0" layoutInCell="1" allowOverlap="1" wp14:anchorId="12DEE4A4" wp14:editId="4CF8AFE7">
+          <wp:anchor distT="0" distB="0" distL="0" distR="0" simplePos="0" relativeHeight="15729664" behindDoc="0" locked="0" layoutInCell="1" allowOverlap="1" wp14:anchorId="12DEE4A4" wp14:editId="0C6D2A11">
             <wp:simplePos x="0" y="0"/>
-            <wp:positionH relativeFrom="page">
+            <wp:positionH relativeFrom="margin">
               <wp:align>right</wp:align>
             </wp:positionH>
             <wp:positionV relativeFrom="paragraph">
-              <wp:posOffset>8255</wp:posOffset>
+              <wp:posOffset>10160</wp:posOffset>
             </wp:positionV>
             <wp:extent cx="3151504" cy="1151890"/>
             <wp:effectExtent l="0" t="0" r="0" b="0"/>
@@ -2793,19 +2827,30 @@
           <w:sz w:val="20"/>
         </w:rPr>
       </w:pPr>
+    </w:p>
+    <w:p>
+      <w:pPr>
+        <w:pStyle w:val="Corpodetexto"/>
+        <w:rPr>
+          <w:rFonts w:ascii="Arial"/>
+          <w:b/>
+          <w:i/>
+          <w:sz w:val="20"/>
+        </w:rPr>
+      </w:pPr>
       <w:r>
         <w:rPr>
           <w:noProof/>
           <w:lang w:val="pt-BR" w:eastAsia="pt-BR"/>
         </w:rPr>
         <w:drawing>
-          <wp:anchor distT="0" distB="0" distL="0" distR="0" simplePos="0" relativeHeight="15730176" behindDoc="0" locked="0" layoutInCell="1" allowOverlap="1" wp14:anchorId="7A6A85E9" wp14:editId="2912B242">
+          <wp:anchor distT="0" distB="0" distL="0" distR="0" simplePos="0" relativeHeight="15730176" behindDoc="0" locked="0" layoutInCell="1" allowOverlap="1" wp14:anchorId="7A6A85E9" wp14:editId="4CB3BDE3">
             <wp:simplePos x="0" y="0"/>
-            <wp:positionH relativeFrom="page">
-              <wp:posOffset>3523615</wp:posOffset>
+            <wp:positionH relativeFrom="margin">
+              <wp:posOffset>3354070</wp:posOffset>
             </wp:positionH>
             <wp:positionV relativeFrom="paragraph">
-              <wp:posOffset>5715</wp:posOffset>
+              <wp:posOffset>6350</wp:posOffset>
             </wp:positionV>
             <wp:extent cx="612139" cy="807085"/>
             <wp:effectExtent l="0" t="0" r="0" b="0"/>

</xml_diff>

<commit_message>
Meu Cadastro: lider tambem pode trocar a propria senha
Co-Authored-By: Claude Sonnet 5 <noreply@anthropic.com>
</commit_message>
<xml_diff>
--- a/web/termos/permuta-modelo.docx
+++ b/web/termos/permuta-modelo.docx
@@ -61,6 +61,8 @@
         <w:spacing w:before="2"/>
         <w:rPr>
           <w:rFonts w:ascii="Times New Roman"/>
+          <w:b/>
+          <w:bCs/>
           <w:sz w:val="15"/>
         </w:rPr>
       </w:pPr>
@@ -72,17 +74,23 @@
         <w:jc w:val="both"/>
         <w:rPr>
           <w:rFonts w:ascii="Arial" w:hAnsi="Arial" w:cs="Arial"/>
+          <w:b/>
+          <w:bCs/>
         </w:rPr>
       </w:pPr>
       <w:r>
         <w:rPr>
           <w:rFonts w:ascii="Arial" w:hAnsi="Arial" w:cs="Arial"/>
+          <w:b/>
+          <w:bCs/>
         </w:rPr>
         <w:t>EXCELENTÍSSIMO</w:t>
       </w:r>
       <w:r>
         <w:rPr>
           <w:rFonts w:ascii="Arial" w:hAnsi="Arial" w:cs="Arial"/>
+          <w:b/>
+          <w:bCs/>
           <w:spacing w:val="-12"/>
         </w:rPr>
         <w:t xml:space="preserve"> </w:t>
@@ -90,12 +98,16 @@
       <w:r>
         <w:rPr>
           <w:rFonts w:ascii="Arial" w:hAnsi="Arial" w:cs="Arial"/>
+          <w:b/>
+          <w:bCs/>
         </w:rPr>
         <w:t>SENHOR</w:t>
       </w:r>
       <w:r>
         <w:rPr>
           <w:rFonts w:ascii="Arial" w:hAnsi="Arial" w:cs="Arial"/>
+          <w:b/>
+          <w:bCs/>
           <w:spacing w:val="-8"/>
         </w:rPr>
         <w:t xml:space="preserve"> </w:t>
@@ -103,12 +115,16 @@
       <w:r>
         <w:rPr>
           <w:rFonts w:ascii="Arial" w:hAnsi="Arial" w:cs="Arial"/>
+          <w:b/>
+          <w:bCs/>
         </w:rPr>
         <w:t>DIRETOR</w:t>
       </w:r>
       <w:r>
         <w:rPr>
           <w:rFonts w:ascii="Arial" w:hAnsi="Arial" w:cs="Arial"/>
+          <w:b/>
+          <w:bCs/>
           <w:spacing w:val="-9"/>
         </w:rPr>
         <w:t xml:space="preserve"> </w:t>
@@ -116,12 +132,16 @@
       <w:r>
         <w:rPr>
           <w:rFonts w:ascii="Arial" w:hAnsi="Arial" w:cs="Arial"/>
+          <w:b/>
+          <w:bCs/>
         </w:rPr>
         <w:t>DO</w:t>
       </w:r>
       <w:r>
         <w:rPr>
           <w:rFonts w:ascii="Arial" w:hAnsi="Arial" w:cs="Arial"/>
+          <w:b/>
+          <w:bCs/>
           <w:spacing w:val="-11"/>
         </w:rPr>
         <w:t xml:space="preserve"> </w:t>
@@ -129,12 +149,16 @@
       <w:r>
         <w:rPr>
           <w:rFonts w:ascii="Arial" w:hAnsi="Arial" w:cs="Arial"/>
+          <w:b/>
+          <w:bCs/>
         </w:rPr>
         <w:t>DEPARTAMENTO</w:t>
       </w:r>
       <w:r>
         <w:rPr>
           <w:rFonts w:ascii="Arial" w:hAnsi="Arial" w:cs="Arial"/>
+          <w:b/>
+          <w:bCs/>
           <w:spacing w:val="-12"/>
         </w:rPr>
         <w:t xml:space="preserve"> </w:t>
@@ -142,12 +166,16 @@
       <w:r>
         <w:rPr>
           <w:rFonts w:ascii="Arial" w:hAnsi="Arial" w:cs="Arial"/>
+          <w:b/>
+          <w:bCs/>
         </w:rPr>
         <w:t>DE</w:t>
       </w:r>
       <w:r>
         <w:rPr>
           <w:rFonts w:ascii="Arial" w:hAnsi="Arial" w:cs="Arial"/>
+          <w:b/>
+          <w:bCs/>
           <w:spacing w:val="-4"/>
         </w:rPr>
         <w:t xml:space="preserve"> </w:t>
@@ -155,12 +183,16 @@
       <w:r>
         <w:rPr>
           <w:rFonts w:ascii="Arial" w:hAnsi="Arial" w:cs="Arial"/>
+          <w:b/>
+          <w:bCs/>
         </w:rPr>
         <w:t>ATIVIDADES</w:t>
       </w:r>
       <w:r>
         <w:rPr>
           <w:rFonts w:ascii="Arial" w:hAnsi="Arial" w:cs="Arial"/>
+          <w:b/>
+          <w:bCs/>
           <w:spacing w:val="-9"/>
         </w:rPr>
         <w:t xml:space="preserve"> </w:t>
@@ -168,6 +200,8 @@
       <w:r>
         <w:rPr>
           <w:rFonts w:ascii="Arial" w:hAnsi="Arial" w:cs="Arial"/>
+          <w:b/>
+          <w:bCs/>
         </w:rPr>
         <w:t>POLICIAIS</w:t>
       </w:r>
@@ -300,13 +334,202 @@
       <w:pPr>
         <w:pStyle w:val="Corpodetexto"/>
         <w:spacing w:line="276" w:lineRule="auto"/>
+        <w:ind w:left="851" w:right="842"/>
+        <w:rPr>
+          <w:rFonts w:ascii="Arial" w:hAnsi="Arial" w:cs="Arial"/>
+          <w:b/>
+          <w:sz w:val="24"/>
+          <w:szCs w:val="24"/>
+        </w:rPr>
+      </w:pPr>
+    </w:p>
+    <w:p>
+      <w:pPr>
+        <w:pStyle w:val="Corpodetexto"/>
+        <w:shd w:val="clear" w:color="auto" w:fill="EEECE1" w:themeFill="background2"/>
+        <w:spacing w:line="276" w:lineRule="auto"/>
+        <w:ind w:left="851" w:right="842"/>
+        <w:rPr>
+          <w:rFonts w:ascii="Arial" w:hAnsi="Arial" w:cs="Arial"/>
+          <w:b/>
+          <w:sz w:val="24"/>
+          <w:szCs w:val="24"/>
+        </w:rPr>
+      </w:pPr>
+      <w:r>
+        <w:rPr>
+          <w:rFonts w:ascii="Arial" w:hAnsi="Arial" w:cs="Arial"/>
+          <w:b/>
+          <w:sz w:val="24"/>
+          <w:szCs w:val="24"/>
+        </w:rPr>
+        <w:t>DATA</w:t>
+      </w:r>
+      <w:r>
+        <w:rPr>
+          <w:rFonts w:ascii="Arial" w:hAnsi="Arial" w:cs="Arial"/>
+          <w:b/>
+          <w:spacing w:val="-5"/>
+          <w:sz w:val="24"/>
+          <w:szCs w:val="24"/>
+        </w:rPr>
+        <w:t xml:space="preserve"> </w:t>
+      </w:r>
+      <w:r>
+        <w:rPr>
+          <w:rFonts w:ascii="Arial" w:hAnsi="Arial" w:cs="Arial"/>
+          <w:b/>
+          <w:sz w:val="24"/>
+          <w:szCs w:val="24"/>
+        </w:rPr>
+        <w:t>DA</w:t>
+      </w:r>
+      <w:r>
+        <w:rPr>
+          <w:rFonts w:ascii="Arial" w:hAnsi="Arial" w:cs="Arial"/>
+          <w:b/>
+          <w:spacing w:val="1"/>
+          <w:sz w:val="24"/>
+          <w:szCs w:val="24"/>
+        </w:rPr>
+        <w:t xml:space="preserve"> </w:t>
+      </w:r>
+      <w:r>
+        <w:rPr>
+          <w:rFonts w:ascii="Arial" w:hAnsi="Arial" w:cs="Arial"/>
+          <w:b/>
+          <w:sz w:val="24"/>
+          <w:szCs w:val="24"/>
+        </w:rPr>
+        <w:t xml:space="preserve">PERMUTA: </w:t>
+      </w:r>
+      <w:r>
+        <w:rPr>
+          <w:rFonts w:ascii="Arial" w:eastAsia="Arial" w:hAnsi="Arial" w:cs="Arial"/>
+          <w:b/>
+          <w:sz w:val="24"/>
+          <w:szCs w:val="24"/>
+        </w:rPr>
+        <w:t>{data_permuta}</w:t>
+      </w:r>
+      <w:r>
+        <w:rPr>
+          <w:rFonts w:ascii="Arial" w:eastAsia="Arial" w:hAnsi="Arial" w:cs="Arial"/>
+          <w:b/>
+          <w:sz w:val="24"/>
+          <w:szCs w:val="24"/>
+        </w:rPr>
+        <w:t xml:space="preserve">  - TURNO: </w:t>
+      </w:r>
+      <w:r>
+        <w:rPr>
+          <w:rFonts w:ascii="Arial" w:eastAsia="Arial" w:hAnsi="Arial" w:cs="Arial"/>
+          <w:b/>
+          <w:sz w:val="24"/>
+          <w:szCs w:val="24"/>
+        </w:rPr>
+        <w:t xml:space="preserve"> </w:t>
+      </w:r>
+      <w:r>
+        <w:rPr>
+          <w:b/>
+          <w:sz w:val="24"/>
+          <w:szCs w:val="24"/>
+        </w:rPr>
+        <w:t>({turno_diurno})08h às</w:t>
+      </w:r>
+      <w:r>
+        <w:rPr>
+          <w:b/>
+          <w:spacing w:val="-1"/>
+          <w:sz w:val="24"/>
+          <w:szCs w:val="24"/>
+        </w:rPr>
+        <w:t xml:space="preserve"> </w:t>
+      </w:r>
+      <w:r>
+        <w:rPr>
+          <w:b/>
+          <w:sz w:val="24"/>
+          <w:szCs w:val="24"/>
+        </w:rPr>
+        <w:t>20h</w:t>
+      </w:r>
+      <w:r>
+        <w:rPr>
+          <w:b/>
+          <w:sz w:val="24"/>
+          <w:szCs w:val="24"/>
+        </w:rPr>
+        <w:t xml:space="preserve"> </w:t>
+      </w:r>
+      <w:r>
+        <w:rPr>
+          <w:b/>
+          <w:sz w:val="24"/>
+          <w:szCs w:val="24"/>
+        </w:rPr>
+        <w:t>({turno_noturno}</w:t>
+      </w:r>
+      <w:r>
+        <w:rPr>
+          <w:rFonts w:ascii="Arial" w:hAnsi="Arial" w:cs="Arial"/>
+          <w:b/>
+          <w:sz w:val="24"/>
+          <w:szCs w:val="24"/>
+        </w:rPr>
+        <w:t>)</w:t>
+      </w:r>
+      <w:r>
+        <w:rPr>
+          <w:rFonts w:ascii="Arial" w:hAnsi="Arial" w:cs="Arial"/>
+          <w:b/>
+          <w:spacing w:val="1"/>
+          <w:sz w:val="24"/>
+          <w:szCs w:val="24"/>
+        </w:rPr>
+        <w:t xml:space="preserve"> </w:t>
+      </w:r>
+      <w:r>
+        <w:rPr>
+          <w:rFonts w:ascii="Arial" w:hAnsi="Arial" w:cs="Arial"/>
+          <w:b/>
+          <w:sz w:val="24"/>
+          <w:szCs w:val="24"/>
+        </w:rPr>
+        <w:t>20h</w:t>
+      </w:r>
+      <w:r>
+        <w:rPr>
+          <w:rFonts w:ascii="Arial" w:hAnsi="Arial" w:cs="Arial"/>
+          <w:b/>
+          <w:spacing w:val="-1"/>
+          <w:sz w:val="24"/>
+          <w:szCs w:val="24"/>
+        </w:rPr>
+        <w:t xml:space="preserve"> </w:t>
+      </w:r>
+      <w:r>
+        <w:rPr>
+          <w:rFonts w:ascii="Arial" w:hAnsi="Arial" w:cs="Arial"/>
+          <w:b/>
+          <w:sz w:val="24"/>
+          <w:szCs w:val="24"/>
+        </w:rPr>
+        <w:t>às 08h</w:t>
+      </w:r>
+    </w:p>
+    <w:p>
+      <w:pPr>
+        <w:pStyle w:val="Corpodetexto"/>
+        <w:spacing w:line="276" w:lineRule="auto"/>
         <w:ind w:left="775" w:right="842"/>
         <w:jc w:val="both"/>
         <w:rPr>
           <w:rFonts w:ascii="Arial" w:hAnsi="Arial" w:cs="Arial"/>
           <w:b/>
-          <w:sz w:val="24"/>
-          <w:szCs w:val="24"/>
+          <w:sz w:val="12"/>
+          <w:szCs w:val="12"/>
         </w:rPr>
       </w:pPr>
     </w:p>
@@ -315,231 +538,22 @@
         <w:tblStyle w:val="Tabelacomgrade"/>
         <w:tblW w:w="9993" w:type="dxa"/>
         <w:tblInd w:w="775" w:type="dxa"/>
+        <w:tblBorders>
+          <w:top w:val="none" w:sz="0" w:space="0" w:color="auto"/>
+          <w:left w:val="none" w:sz="0" w:space="0" w:color="auto"/>
+          <w:bottom w:val="none" w:sz="0" w:space="0" w:color="auto"/>
+          <w:right w:val="none" w:sz="0" w:space="0" w:color="auto"/>
+          <w:insideH w:val="none" w:sz="0" w:space="0" w:color="auto"/>
+          <w:insideV w:val="none" w:sz="0" w:space="0" w:color="auto"/>
+        </w:tblBorders>
         <w:tblLook w:val="04A0" w:firstRow="1" w:lastRow="0" w:firstColumn="1" w:lastColumn="0" w:noHBand="0" w:noVBand="1"/>
       </w:tblPr>
       <w:tblGrid>
         <w:gridCol w:w="2339"/>
-        <w:gridCol w:w="2693"/>
-        <w:gridCol w:w="1205"/>
+        <w:gridCol w:w="3260"/>
+        <w:gridCol w:w="638"/>
         <w:gridCol w:w="3756"/>
       </w:tblGrid>
-      <w:tr>
-        <w:tc>
-          <w:tcPr>
-            <w:tcW w:w="9993" w:type="dxa"/>
-            <w:gridSpan w:val="4"/>
-          </w:tcPr>
-          <w:p>
-            <w:pPr>
-              <w:pStyle w:val="Corpodetexto"/>
-              <w:spacing w:line="276" w:lineRule="auto"/>
-              <w:ind w:right="842"/>
-              <w:rPr>
-                <w:rFonts w:ascii="Arial" w:eastAsia="Arial" w:hAnsi="Arial" w:cs="Arial"/>
-                <w:b/>
-                <w:bCs/>
-                <w:sz w:val="24"/>
-                <w:szCs w:val="24"/>
-                <w:u w:val="thick" w:color="000000"/>
-                <w:shd w:val="clear" w:color="auto" w:fill="D9D9D9"/>
-              </w:rPr>
-            </w:pPr>
-            <w:r>
-              <w:rPr>
-                <w:rFonts w:ascii="Arial" w:eastAsia="Arial" w:hAnsi="Arial" w:cs="Arial"/>
-                <w:b/>
-                <w:sz w:val="24"/>
-                <w:szCs w:val="24"/>
-              </w:rPr>
-              <w:br/>
-            </w:r>
-            <w:r>
-              <w:rPr>
-                <w:rFonts w:ascii="Arial" w:hAnsi="Arial" w:cs="Arial"/>
-                <w:b/>
-                <w:sz w:val="24"/>
-                <w:szCs w:val="24"/>
-              </w:rPr>
-              <w:t>DATA</w:t>
-            </w:r>
-            <w:r>
-              <w:rPr>
-                <w:rFonts w:ascii="Arial" w:hAnsi="Arial" w:cs="Arial"/>
-                <w:b/>
-                <w:spacing w:val="-5"/>
-                <w:sz w:val="24"/>
-                <w:szCs w:val="24"/>
-              </w:rPr>
-              <w:t xml:space="preserve"> </w:t>
-            </w:r>
-            <w:r>
-              <w:rPr>
-                <w:rFonts w:ascii="Arial" w:hAnsi="Arial" w:cs="Arial"/>
-                <w:b/>
-                <w:sz w:val="24"/>
-                <w:szCs w:val="24"/>
-              </w:rPr>
-              <w:t>DA</w:t>
-            </w:r>
-            <w:r>
-              <w:rPr>
-                <w:rFonts w:ascii="Arial" w:hAnsi="Arial" w:cs="Arial"/>
-                <w:b/>
-                <w:spacing w:val="1"/>
-                <w:sz w:val="24"/>
-                <w:szCs w:val="24"/>
-              </w:rPr>
-              <w:t xml:space="preserve"> </w:t>
-            </w:r>
-            <w:r>
-              <w:rPr>
-                <w:rFonts w:ascii="Arial" w:hAnsi="Arial" w:cs="Arial"/>
-                <w:b/>
-                <w:sz w:val="24"/>
-                <w:szCs w:val="24"/>
-              </w:rPr>
-              <w:t xml:space="preserve">PERMUTA: </w:t>
-            </w:r>
-            <w:r>
-              <w:rPr>
-                <w:rFonts w:ascii="Arial" w:eastAsia="Arial" w:hAnsi="Arial" w:cs="Arial"/>
-                <w:b/>
-                <w:sz w:val="24"/>
-                <w:szCs w:val="24"/>
-              </w:rPr>
-              <w:t>{data_permuta}</w:t>
-            </w:r>
-            <w:r>
-              <w:rPr>
-                <w:rFonts w:ascii="Arial" w:eastAsia="Arial" w:hAnsi="Arial" w:cs="Arial"/>
-                <w:b/>
-                <w:sz w:val="24"/>
-                <w:szCs w:val="24"/>
-              </w:rPr>
-              <w:t xml:space="preserve">  - TURNO: </w:t>
-            </w:r>
-          </w:p>
-          <w:p>
-            <w:pPr>
-              <w:pStyle w:val="TableParagraph"/>
-              <w:tabs>
-                <w:tab w:val="left" w:pos="1198"/>
-              </w:tabs>
-              <w:ind w:left="74"/>
-              <w:rPr>
-                <w:b/>
-                <w:sz w:val="24"/>
-                <w:szCs w:val="24"/>
-              </w:rPr>
-            </w:pPr>
-            <w:r>
-              <w:rPr>
-                <w:b/>
-                <w:sz w:val="24"/>
-                <w:szCs w:val="24"/>
-              </w:rPr>
-              <w:t>({turno_diurno})08h às</w:t>
-            </w:r>
-            <w:r>
-              <w:rPr>
-                <w:b/>
-                <w:spacing w:val="-1"/>
-                <w:sz w:val="24"/>
-                <w:szCs w:val="24"/>
-              </w:rPr>
-              <w:t xml:space="preserve"> </w:t>
-            </w:r>
-            <w:r>
-              <w:rPr>
-                <w:b/>
-                <w:sz w:val="24"/>
-                <w:szCs w:val="24"/>
-              </w:rPr>
-              <w:t>20h</w:t>
-            </w:r>
-            <w:r>
-              <w:rPr>
-                <w:b/>
-                <w:spacing w:val="-4"/>
-                <w:sz w:val="24"/>
-                <w:szCs w:val="24"/>
-              </w:rPr>
-              <w:t xml:space="preserve"> </w:t>
-            </w:r>
-            <w:r>
-              <w:rPr>
-                <w:b/>
-                <w:sz w:val="24"/>
-                <w:szCs w:val="24"/>
-              </w:rPr>
-              <w:t>({turno_noturno}</w:t>
-            </w:r>
-          </w:p>
-          <w:p>
-            <w:pPr>
-              <w:pStyle w:val="Corpodetexto"/>
-              <w:spacing w:line="276" w:lineRule="auto"/>
-              <w:ind w:right="842"/>
-              <w:rPr>
-                <w:rFonts w:ascii="Arial" w:eastAsia="Arial" w:hAnsi="Arial" w:cs="Arial"/>
-                <w:b/>
-                <w:bCs/>
-                <w:sz w:val="24"/>
-                <w:szCs w:val="24"/>
-                <w:u w:val="thick" w:color="000000"/>
-                <w:shd w:val="clear" w:color="auto" w:fill="D9D9D9"/>
-              </w:rPr>
-            </w:pPr>
-            <w:r>
-              <w:rPr>
-                <w:rFonts w:ascii="Arial" w:hAnsi="Arial" w:cs="Arial"/>
-                <w:b/>
-                <w:sz w:val="24"/>
-                <w:szCs w:val="24"/>
-              </w:rPr>
-              <w:t xml:space="preserve">  )</w:t>
-            </w:r>
-            <w:r>
-              <w:rPr>
-                <w:rFonts w:ascii="Arial" w:hAnsi="Arial" w:cs="Arial"/>
-                <w:b/>
-                <w:spacing w:val="1"/>
-                <w:sz w:val="24"/>
-                <w:szCs w:val="24"/>
-              </w:rPr>
-              <w:t xml:space="preserve"> </w:t>
-            </w:r>
-            <w:r>
-              <w:rPr>
-                <w:rFonts w:ascii="Arial" w:hAnsi="Arial" w:cs="Arial"/>
-                <w:b/>
-                <w:sz w:val="24"/>
-                <w:szCs w:val="24"/>
-              </w:rPr>
-              <w:t>20h</w:t>
-            </w:r>
-            <w:r>
-              <w:rPr>
-                <w:rFonts w:ascii="Arial" w:hAnsi="Arial" w:cs="Arial"/>
-                <w:b/>
-                <w:spacing w:val="-1"/>
-                <w:sz w:val="24"/>
-                <w:szCs w:val="24"/>
-              </w:rPr>
-              <w:t xml:space="preserve"> </w:t>
-            </w:r>
-            <w:r>
-              <w:rPr>
-                <w:rFonts w:ascii="Arial" w:hAnsi="Arial" w:cs="Arial"/>
-                <w:b/>
-                <w:sz w:val="24"/>
-                <w:szCs w:val="24"/>
-              </w:rPr>
-              <w:t>às 08h</w:t>
-            </w:r>
-          </w:p>
-        </w:tc>
-      </w:tr>
       <w:tr>
         <w:trPr>
           <w:trHeight w:hRule="exact" w:val="57"/>
@@ -644,7 +658,7 @@
         </w:trPr>
         <w:tc>
           <w:tcPr>
-            <w:tcW w:w="5032" w:type="dxa"/>
+            <w:tcW w:w="5599" w:type="dxa"/>
             <w:gridSpan w:val="2"/>
             <w:vAlign w:val="bottom"/>
           </w:tcPr>
@@ -673,7 +687,7 @@
         </w:tc>
         <w:tc>
           <w:tcPr>
-            <w:tcW w:w="4961" w:type="dxa"/>
+            <w:tcW w:w="4394" w:type="dxa"/>
             <w:gridSpan w:val="2"/>
             <w:vAlign w:val="bottom"/>
           </w:tcPr>
@@ -753,6 +767,7 @@
                 <w:tab w:val="left" w:pos="1198"/>
               </w:tabs>
               <w:ind w:left="74"/>
+              <w:jc w:val="center"/>
               <w:rPr>
                 <w:b/>
                 <w:sz w:val="24"/>
@@ -820,12 +835,20 @@
         <w:tblStyle w:val="Tabelacomgrade"/>
         <w:tblW w:w="9993" w:type="dxa"/>
         <w:tblInd w:w="775" w:type="dxa"/>
+        <w:tblBorders>
+          <w:top w:val="none" w:sz="0" w:space="0" w:color="auto"/>
+          <w:left w:val="none" w:sz="0" w:space="0" w:color="auto"/>
+          <w:bottom w:val="none" w:sz="0" w:space="0" w:color="auto"/>
+          <w:right w:val="none" w:sz="0" w:space="0" w:color="auto"/>
+          <w:insideH w:val="none" w:sz="0" w:space="0" w:color="auto"/>
+          <w:insideV w:val="none" w:sz="0" w:space="0" w:color="auto"/>
+        </w:tblBorders>
         <w:tblLook w:val="04A0" w:firstRow="1" w:lastRow="0" w:firstColumn="1" w:lastColumn="0" w:noHBand="0" w:noVBand="1"/>
       </w:tblPr>
       <w:tblGrid>
         <w:gridCol w:w="2339"/>
-        <w:gridCol w:w="2410"/>
-        <w:gridCol w:w="1417"/>
+        <w:gridCol w:w="3260"/>
+        <w:gridCol w:w="567"/>
         <w:gridCol w:w="3827"/>
       </w:tblGrid>
       <w:tr>
@@ -899,7 +922,7 @@
         </w:trPr>
         <w:tc>
           <w:tcPr>
-            <w:tcW w:w="4749" w:type="dxa"/>
+            <w:tcW w:w="5599" w:type="dxa"/>
             <w:gridSpan w:val="2"/>
             <w:vAlign w:val="bottom"/>
           </w:tcPr>
@@ -928,7 +951,7 @@
         </w:tc>
         <w:tc>
           <w:tcPr>
-            <w:tcW w:w="5244" w:type="dxa"/>
+            <w:tcW w:w="4394" w:type="dxa"/>
             <w:gridSpan w:val="2"/>
             <w:vAlign w:val="bottom"/>
           </w:tcPr>
@@ -1000,6 +1023,7 @@
                 <w:tab w:val="left" w:pos="1198"/>
               </w:tabs>
               <w:ind w:left="74"/>
+              <w:jc w:val="center"/>
               <w:rPr>
                 <w:b/>
                 <w:sz w:val="24"/>
@@ -1900,7 +1924,7 @@
           </mc:Choice>
           <mc:Fallback>
             <w:pict>
-              <v:line w14:anchorId="1045A7CE" id="Conector reto 1" o:spid="_x0000_s1026" style="position:absolute;z-index:251659264;visibility:visible;mso-wrap-style:square;mso-wrap-distance-left:9pt;mso-wrap-distance-top:0;mso-wrap-distance-right:9pt;mso-wrap-distance-bottom:0;mso-position-horizontal:absolute;mso-position-horizontal-relative:text;mso-position-vertical:absolute;mso-position-vertical-relative:text" from="342pt,2.45pt" to="534.6pt,2.45pt" o:gfxdata="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" strokecolor="black [3200]" strokeweight="2pt">
+              <v:line w14:anchorId="4F72D3EA" id="Conector reto 1" o:spid="_x0000_s1026" style="position:absolute;z-index:251659264;visibility:visible;mso-wrap-style:square;mso-wrap-distance-left:9pt;mso-wrap-distance-top:0;mso-wrap-distance-right:9pt;mso-wrap-distance-bottom:0;mso-position-horizontal:absolute;mso-position-horizontal-relative:text;mso-position-vertical:absolute;mso-position-vertical-relative:text" from="342pt,2.45pt" to="534.6pt,2.45pt" o:gfxdata="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" strokecolor="black [3200]" strokeweight="2pt">
                 <v:shadow on="t" color="black" opacity="24903f" origin=",.5" offset="0,.55556mm"/>
               </v:line>
             </w:pict>
@@ -2070,7 +2094,8 @@
           <w:rFonts w:ascii="Arial" w:hAnsi="Arial"/>
           <w:b/>
           <w:i/>
-          <w:sz w:val="20"/>
+          <w:sz w:val="8"/>
+          <w:szCs w:val="8"/>
         </w:rPr>
       </w:pPr>
       <w:r>
@@ -2078,8 +2103,6 @@
           <w:rFonts w:ascii="Arial" w:hAnsi="Arial"/>
           <w:b/>
           <w:i/>
-          <w:sz w:val="20"/>
-          <w:u w:val="single"/>
         </w:rPr>
         <w:t>OBS1:</w:t>
       </w:r>
@@ -2089,18 +2112,14 @@
           <w:b/>
           <w:i/>
           <w:spacing w:val="24"/>
-          <w:sz w:val="20"/>
-          <w:u w:val="single"/>
-        </w:rPr>
-        <w:t xml:space="preserve"> </w:t>
-      </w:r>
-      <w:r>
-        <w:rPr>
-          <w:rFonts w:ascii="Arial" w:hAnsi="Arial"/>
-          <w:b/>
-          <w:i/>
-          <w:sz w:val="20"/>
-          <w:u w:val="single"/>
+        </w:rPr>
+        <w:t xml:space="preserve"> </w:t>
+      </w:r>
+      <w:r>
+        <w:rPr>
+          <w:rFonts w:ascii="Arial" w:hAnsi="Arial"/>
+          <w:b/>
+          <w:i/>
         </w:rPr>
         <w:t>PEDIDOS</w:t>
       </w:r>
@@ -2110,18 +2129,14 @@
           <w:b/>
           <w:i/>
           <w:spacing w:val="28"/>
-          <w:sz w:val="20"/>
-          <w:u w:val="single"/>
-        </w:rPr>
-        <w:t xml:space="preserve"> </w:t>
-      </w:r>
-      <w:r>
-        <w:rPr>
-          <w:rFonts w:ascii="Arial" w:hAnsi="Arial"/>
-          <w:b/>
-          <w:i/>
-          <w:sz w:val="20"/>
-          <w:u w:val="single"/>
+        </w:rPr>
+        <w:t xml:space="preserve"> </w:t>
+      </w:r>
+      <w:r>
+        <w:rPr>
+          <w:rFonts w:ascii="Arial" w:hAnsi="Arial"/>
+          <w:b/>
+          <w:i/>
         </w:rPr>
         <w:t>DE</w:t>
       </w:r>
@@ -2131,18 +2146,14 @@
           <w:b/>
           <w:i/>
           <w:spacing w:val="28"/>
-          <w:sz w:val="20"/>
-          <w:u w:val="single"/>
-        </w:rPr>
-        <w:t xml:space="preserve"> </w:t>
-      </w:r>
-      <w:r>
-        <w:rPr>
-          <w:rFonts w:ascii="Arial" w:hAnsi="Arial"/>
-          <w:b/>
-          <w:i/>
-          <w:sz w:val="20"/>
-          <w:u w:val="single"/>
+        </w:rPr>
+        <w:t xml:space="preserve"> </w:t>
+      </w:r>
+      <w:r>
+        <w:rPr>
+          <w:rFonts w:ascii="Arial" w:hAnsi="Arial"/>
+          <w:b/>
+          <w:i/>
         </w:rPr>
         <w:t>PERMUTA</w:t>
       </w:r>
@@ -2152,18 +2163,14 @@
           <w:b/>
           <w:i/>
           <w:spacing w:val="27"/>
-          <w:sz w:val="20"/>
-          <w:u w:val="single"/>
-        </w:rPr>
-        <w:t xml:space="preserve"> </w:t>
-      </w:r>
-      <w:r>
-        <w:rPr>
-          <w:rFonts w:ascii="Arial" w:hAnsi="Arial"/>
-          <w:b/>
-          <w:i/>
-          <w:sz w:val="20"/>
-          <w:u w:val="single"/>
+        </w:rPr>
+        <w:t xml:space="preserve"> </w:t>
+      </w:r>
+      <w:r>
+        <w:rPr>
+          <w:rFonts w:ascii="Arial" w:hAnsi="Arial"/>
+          <w:b/>
+          <w:i/>
         </w:rPr>
         <w:t>DE</w:t>
       </w:r>
@@ -2173,18 +2180,14 @@
           <w:b/>
           <w:i/>
           <w:spacing w:val="22"/>
-          <w:sz w:val="20"/>
-          <w:u w:val="single"/>
-        </w:rPr>
-        <w:t xml:space="preserve"> </w:t>
-      </w:r>
-      <w:r>
-        <w:rPr>
-          <w:rFonts w:ascii="Arial" w:hAnsi="Arial"/>
-          <w:b/>
-          <w:i/>
-          <w:sz w:val="20"/>
-          <w:u w:val="single"/>
+        </w:rPr>
+        <w:t xml:space="preserve"> </w:t>
+      </w:r>
+      <w:r>
+        <w:rPr>
+          <w:rFonts w:ascii="Arial" w:hAnsi="Arial"/>
+          <w:b/>
+          <w:i/>
         </w:rPr>
         <w:t>PLANTÃO</w:t>
       </w:r>
@@ -2194,18 +2197,14 @@
           <w:b/>
           <w:i/>
           <w:spacing w:val="26"/>
-          <w:sz w:val="20"/>
-          <w:u w:val="single"/>
-        </w:rPr>
-        <w:t xml:space="preserve"> </w:t>
-      </w:r>
-      <w:r>
-        <w:rPr>
-          <w:rFonts w:ascii="Arial" w:hAnsi="Arial"/>
-          <w:b/>
-          <w:i/>
-          <w:sz w:val="20"/>
-          <w:u w:val="single"/>
+        </w:rPr>
+        <w:t xml:space="preserve"> </w:t>
+      </w:r>
+      <w:r>
+        <w:rPr>
+          <w:rFonts w:ascii="Arial" w:hAnsi="Arial"/>
+          <w:b/>
+          <w:i/>
         </w:rPr>
         <w:t>DEVERÃO</w:t>
       </w:r>
@@ -2215,18 +2214,14 @@
           <w:b/>
           <w:i/>
           <w:spacing w:val="26"/>
-          <w:sz w:val="20"/>
-          <w:u w:val="single"/>
-        </w:rPr>
-        <w:t xml:space="preserve"> </w:t>
-      </w:r>
-      <w:r>
-        <w:rPr>
-          <w:rFonts w:ascii="Arial" w:hAnsi="Arial"/>
-          <w:b/>
-          <w:i/>
-          <w:sz w:val="20"/>
-          <w:u w:val="single"/>
+        </w:rPr>
+        <w:t xml:space="preserve"> </w:t>
+      </w:r>
+      <w:r>
+        <w:rPr>
+          <w:rFonts w:ascii="Arial" w:hAnsi="Arial"/>
+          <w:b/>
+          <w:i/>
         </w:rPr>
         <w:t>SER</w:t>
       </w:r>
@@ -2236,18 +2231,14 @@
           <w:b/>
           <w:i/>
           <w:spacing w:val="22"/>
-          <w:sz w:val="20"/>
-          <w:u w:val="single"/>
-        </w:rPr>
-        <w:t xml:space="preserve"> </w:t>
-      </w:r>
-      <w:r>
-        <w:rPr>
-          <w:rFonts w:ascii="Arial" w:hAnsi="Arial"/>
-          <w:b/>
-          <w:i/>
-          <w:sz w:val="20"/>
-          <w:u w:val="single"/>
+        </w:rPr>
+        <w:t xml:space="preserve"> </w:t>
+      </w:r>
+      <w:r>
+        <w:rPr>
+          <w:rFonts w:ascii="Arial" w:hAnsi="Arial"/>
+          <w:b/>
+          <w:i/>
         </w:rPr>
         <w:t>FEITOS</w:t>
       </w:r>
@@ -2257,18 +2248,14 @@
           <w:b/>
           <w:i/>
           <w:spacing w:val="28"/>
-          <w:sz w:val="20"/>
-          <w:u w:val="single"/>
-        </w:rPr>
-        <w:t xml:space="preserve"> </w:t>
-      </w:r>
-      <w:r>
-        <w:rPr>
-          <w:rFonts w:ascii="Arial" w:hAnsi="Arial"/>
-          <w:b/>
-          <w:i/>
-          <w:sz w:val="20"/>
-          <w:u w:val="single"/>
+        </w:rPr>
+        <w:t xml:space="preserve"> </w:t>
+      </w:r>
+      <w:r>
+        <w:rPr>
+          <w:rFonts w:ascii="Arial" w:hAnsi="Arial"/>
+          <w:b/>
+          <w:i/>
         </w:rPr>
         <w:t>NO</w:t>
       </w:r>
@@ -2278,18 +2265,15 @@
           <w:b/>
           <w:i/>
           <w:spacing w:val="35"/>
-          <w:sz w:val="20"/>
-          <w:u w:val="single"/>
-        </w:rPr>
-        <w:t xml:space="preserve"> </w:t>
-      </w:r>
-      <w:r>
-        <w:rPr>
-          <w:rFonts w:ascii="Arial" w:hAnsi="Arial"/>
-          <w:b/>
-          <w:i/>
-          <w:sz w:val="20"/>
-          <w:u w:val="single"/>
+        </w:rPr>
+        <w:t xml:space="preserve"> </w:t>
+      </w:r>
+      <w:r>
+        <w:rPr>
+          <w:rFonts w:ascii="Arial" w:hAnsi="Arial"/>
+          <w:b/>
+          <w:i/>
+          <w:highlight w:val="yellow"/>
         </w:rPr>
         <w:t>PRÁZO</w:t>
       </w:r>
@@ -2299,18 +2283,16 @@
           <w:b/>
           <w:i/>
           <w:spacing w:val="26"/>
-          <w:sz w:val="20"/>
-          <w:u w:val="single"/>
-        </w:rPr>
-        <w:t xml:space="preserve"> </w:t>
-      </w:r>
-      <w:r>
-        <w:rPr>
-          <w:rFonts w:ascii="Arial" w:hAnsi="Arial"/>
-          <w:b/>
-          <w:i/>
-          <w:sz w:val="20"/>
-          <w:u w:val="single"/>
+          <w:highlight w:val="yellow"/>
+        </w:rPr>
+        <w:t xml:space="preserve"> </w:t>
+      </w:r>
+      <w:r>
+        <w:rPr>
+          <w:rFonts w:ascii="Arial" w:hAnsi="Arial"/>
+          <w:b/>
+          <w:i/>
+          <w:highlight w:val="yellow"/>
         </w:rPr>
         <w:t>MÍNIMO</w:t>
       </w:r>
@@ -2320,18 +2302,16 @@
           <w:b/>
           <w:i/>
           <w:spacing w:val="26"/>
-          <w:sz w:val="20"/>
-          <w:u w:val="single"/>
-        </w:rPr>
-        <w:t xml:space="preserve"> </w:t>
-      </w:r>
-      <w:r>
-        <w:rPr>
-          <w:rFonts w:ascii="Arial" w:hAnsi="Arial"/>
-          <w:b/>
-          <w:i/>
-          <w:sz w:val="20"/>
-          <w:u w:val="single"/>
+          <w:highlight w:val="yellow"/>
+        </w:rPr>
+        <w:t xml:space="preserve"> </w:t>
+      </w:r>
+      <w:r>
+        <w:rPr>
+          <w:rFonts w:ascii="Arial" w:hAnsi="Arial"/>
+          <w:b/>
+          <w:i/>
+          <w:highlight w:val="yellow"/>
         </w:rPr>
         <w:t>DE</w:t>
       </w:r>
@@ -2341,18 +2321,16 @@
           <w:b/>
           <w:i/>
           <w:spacing w:val="27"/>
-          <w:sz w:val="20"/>
-          <w:u w:val="single"/>
-        </w:rPr>
-        <w:t xml:space="preserve"> </w:t>
-      </w:r>
-      <w:r>
-        <w:rPr>
-          <w:rFonts w:ascii="Arial" w:hAnsi="Arial"/>
-          <w:b/>
-          <w:i/>
-          <w:sz w:val="20"/>
-          <w:u w:val="single"/>
+          <w:highlight w:val="yellow"/>
+        </w:rPr>
+        <w:t xml:space="preserve"> </w:t>
+      </w:r>
+      <w:r>
+        <w:rPr>
+          <w:rFonts w:ascii="Arial" w:hAnsi="Arial"/>
+          <w:b/>
+          <w:i/>
+          <w:highlight w:val="yellow"/>
         </w:rPr>
         <w:t>2</w:t>
       </w:r>
@@ -2362,18 +2340,16 @@
           <w:b/>
           <w:i/>
           <w:spacing w:val="21"/>
-          <w:sz w:val="20"/>
-          <w:u w:val="single"/>
-        </w:rPr>
-        <w:t xml:space="preserve"> </w:t>
-      </w:r>
-      <w:r>
-        <w:rPr>
-          <w:rFonts w:ascii="Arial" w:hAnsi="Arial"/>
-          <w:b/>
-          <w:i/>
-          <w:sz w:val="20"/>
-          <w:u w:val="single"/>
+          <w:highlight w:val="yellow"/>
+        </w:rPr>
+        <w:t xml:space="preserve"> </w:t>
+      </w:r>
+      <w:r>
+        <w:rPr>
+          <w:rFonts w:ascii="Arial" w:hAnsi="Arial"/>
+          <w:b/>
+          <w:i/>
+          <w:highlight w:val="yellow"/>
         </w:rPr>
         <w:t>DIAS</w:t>
       </w:r>
@@ -2383,17 +2359,16 @@
           <w:b/>
           <w:i/>
           <w:spacing w:val="-53"/>
-          <w:sz w:val="20"/>
-        </w:rPr>
-        <w:t xml:space="preserve"> </w:t>
-      </w:r>
-      <w:r>
-        <w:rPr>
-          <w:rFonts w:ascii="Arial" w:hAnsi="Arial"/>
-          <w:b/>
-          <w:i/>
-          <w:sz w:val="20"/>
-          <w:u w:val="single"/>
+          <w:highlight w:val="yellow"/>
+        </w:rPr>
+        <w:t xml:space="preserve"> </w:t>
+      </w:r>
+      <w:r>
+        <w:rPr>
+          <w:rFonts w:ascii="Arial" w:hAnsi="Arial"/>
+          <w:b/>
+          <w:i/>
+          <w:highlight w:val="yellow"/>
         </w:rPr>
         <w:t>ÚTEIS</w:t>
       </w:r>
@@ -2403,18 +2378,16 @@
           <w:b/>
           <w:i/>
           <w:spacing w:val="-1"/>
-          <w:sz w:val="20"/>
-          <w:u w:val="single"/>
-        </w:rPr>
-        <w:t xml:space="preserve"> </w:t>
-      </w:r>
-      <w:r>
-        <w:rPr>
-          <w:rFonts w:ascii="Arial" w:hAnsi="Arial"/>
-          <w:b/>
-          <w:i/>
-          <w:sz w:val="20"/>
-          <w:u w:val="single"/>
+          <w:highlight w:val="yellow"/>
+        </w:rPr>
+        <w:t xml:space="preserve"> </w:t>
+      </w:r>
+      <w:r>
+        <w:rPr>
+          <w:rFonts w:ascii="Arial" w:hAnsi="Arial"/>
+          <w:b/>
+          <w:i/>
+          <w:highlight w:val="yellow"/>
         </w:rPr>
         <w:t>DE</w:t>
       </w:r>
@@ -2424,18 +2397,16 @@
           <w:b/>
           <w:i/>
           <w:spacing w:val="1"/>
-          <w:sz w:val="20"/>
-          <w:u w:val="single"/>
-        </w:rPr>
-        <w:t xml:space="preserve"> </w:t>
-      </w:r>
-      <w:r>
-        <w:rPr>
-          <w:rFonts w:ascii="Arial" w:hAnsi="Arial"/>
-          <w:b/>
-          <w:i/>
-          <w:sz w:val="20"/>
-          <w:u w:val="single"/>
+          <w:highlight w:val="yellow"/>
+        </w:rPr>
+        <w:t xml:space="preserve"> </w:t>
+      </w:r>
+      <w:r>
+        <w:rPr>
+          <w:rFonts w:ascii="Arial" w:hAnsi="Arial"/>
+          <w:b/>
+          <w:i/>
+          <w:highlight w:val="yellow"/>
         </w:rPr>
         <w:t>ANTECEDÊNCIA</w:t>
       </w:r>
@@ -2445,18 +2416,14 @@
           <w:b/>
           <w:i/>
           <w:spacing w:val="-1"/>
-          <w:sz w:val="20"/>
-          <w:u w:val="single"/>
-        </w:rPr>
-        <w:t xml:space="preserve"> </w:t>
-      </w:r>
-      <w:r>
-        <w:rPr>
-          <w:rFonts w:ascii="Arial" w:hAnsi="Arial"/>
-          <w:b/>
-          <w:i/>
-          <w:sz w:val="20"/>
-          <w:u w:val="single"/>
+        </w:rPr>
+        <w:t xml:space="preserve"> </w:t>
+      </w:r>
+      <w:r>
+        <w:rPr>
+          <w:rFonts w:ascii="Arial" w:hAnsi="Arial"/>
+          <w:b/>
+          <w:i/>
         </w:rPr>
         <w:t>A DATA DO</w:t>
       </w:r>
@@ -2466,20 +2433,24 @@
           <w:b/>
           <w:i/>
           <w:spacing w:val="-2"/>
-          <w:sz w:val="20"/>
-          <w:u w:val="single"/>
-        </w:rPr>
-        <w:t xml:space="preserve"> </w:t>
-      </w:r>
-      <w:r>
-        <w:rPr>
-          <w:rFonts w:ascii="Arial" w:hAnsi="Arial"/>
-          <w:b/>
-          <w:i/>
-          <w:sz w:val="20"/>
-          <w:u w:val="single"/>
+        </w:rPr>
+        <w:t xml:space="preserve"> </w:t>
+      </w:r>
+      <w:r>
+        <w:rPr>
+          <w:rFonts w:ascii="Arial" w:hAnsi="Arial"/>
+          <w:b/>
+          <w:i/>
         </w:rPr>
         <w:t>PLANTÃO.</w:t>
+      </w:r>
+      <w:r>
+        <w:rPr>
+          <w:rFonts w:ascii="Arial" w:hAnsi="Arial"/>
+          <w:b/>
+          <w:i/>
+        </w:rPr>
+        <w:br/>
       </w:r>
     </w:p>
     <w:p>
@@ -2489,7 +2460,6 @@
           <w:rFonts w:ascii="Arial" w:hAnsi="Arial"/>
           <w:b/>
           <w:i/>
-          <w:sz w:val="20"/>
         </w:rPr>
       </w:pPr>
       <w:r>
@@ -2497,8 +2467,6 @@
           <w:rFonts w:ascii="Arial" w:hAnsi="Arial"/>
           <w:b/>
           <w:i/>
-          <w:sz w:val="20"/>
-          <w:u w:val="thick"/>
         </w:rPr>
         <w:t>OBS2:</w:t>
       </w:r>
@@ -2508,18 +2476,14 @@
           <w:b/>
           <w:i/>
           <w:spacing w:val="-4"/>
-          <w:sz w:val="20"/>
-          <w:u w:val="thick"/>
-        </w:rPr>
-        <w:t xml:space="preserve"> </w:t>
-      </w:r>
-      <w:r>
-        <w:rPr>
-          <w:rFonts w:ascii="Arial" w:hAnsi="Arial"/>
-          <w:b/>
-          <w:i/>
-          <w:sz w:val="20"/>
-          <w:u w:val="thick"/>
+        </w:rPr>
+        <w:t xml:space="preserve"> </w:t>
+      </w:r>
+      <w:r>
+        <w:rPr>
+          <w:rFonts w:ascii="Arial" w:hAnsi="Arial"/>
+          <w:b/>
+          <w:i/>
         </w:rPr>
         <w:t>NÃO</w:t>
       </w:r>
@@ -2529,18 +2493,14 @@
           <w:b/>
           <w:i/>
           <w:spacing w:val="-3"/>
-          <w:sz w:val="20"/>
-          <w:u w:val="thick"/>
-        </w:rPr>
-        <w:t xml:space="preserve"> </w:t>
-      </w:r>
-      <w:r>
-        <w:rPr>
-          <w:rFonts w:ascii="Arial" w:hAnsi="Arial"/>
-          <w:b/>
-          <w:i/>
-          <w:sz w:val="20"/>
-          <w:u w:val="thick"/>
+        </w:rPr>
+        <w:t xml:space="preserve"> </w:t>
+      </w:r>
+      <w:r>
+        <w:rPr>
+          <w:rFonts w:ascii="Arial" w:hAnsi="Arial"/>
+          <w:b/>
+          <w:i/>
         </w:rPr>
         <w:t>SERÃO</w:t>
       </w:r>
@@ -2550,18 +2510,14 @@
           <w:b/>
           <w:i/>
           <w:spacing w:val="-3"/>
-          <w:sz w:val="20"/>
-          <w:u w:val="thick"/>
-        </w:rPr>
-        <w:t xml:space="preserve"> </w:t>
-      </w:r>
-      <w:r>
-        <w:rPr>
-          <w:rFonts w:ascii="Arial" w:hAnsi="Arial"/>
-          <w:b/>
-          <w:i/>
-          <w:sz w:val="20"/>
-          <w:u w:val="thick"/>
+        </w:rPr>
+        <w:t xml:space="preserve"> </w:t>
+      </w:r>
+      <w:r>
+        <w:rPr>
+          <w:rFonts w:ascii="Arial" w:hAnsi="Arial"/>
+          <w:b/>
+          <w:i/>
         </w:rPr>
         <w:t>ACEITOS</w:t>
       </w:r>
@@ -2571,18 +2527,14 @@
           <w:b/>
           <w:i/>
           <w:spacing w:val="-1"/>
-          <w:sz w:val="20"/>
-          <w:u w:val="thick"/>
-        </w:rPr>
-        <w:t xml:space="preserve"> </w:t>
-      </w:r>
-      <w:r>
-        <w:rPr>
-          <w:rFonts w:ascii="Arial" w:hAnsi="Arial"/>
-          <w:b/>
-          <w:i/>
-          <w:sz w:val="20"/>
-          <w:u w:val="thick"/>
+        </w:rPr>
+        <w:t xml:space="preserve"> </w:t>
+      </w:r>
+      <w:r>
+        <w:rPr>
+          <w:rFonts w:ascii="Arial" w:hAnsi="Arial"/>
+          <w:b/>
+          <w:i/>
         </w:rPr>
         <w:t>PEDIDOS DE</w:t>
       </w:r>
@@ -2592,18 +2544,14 @@
           <w:b/>
           <w:i/>
           <w:spacing w:val="-1"/>
-          <w:sz w:val="20"/>
-          <w:u w:val="thick"/>
-        </w:rPr>
-        <w:t xml:space="preserve"> </w:t>
-      </w:r>
-      <w:r>
-        <w:rPr>
-          <w:rFonts w:ascii="Arial" w:hAnsi="Arial"/>
-          <w:b/>
-          <w:i/>
-          <w:sz w:val="20"/>
-          <w:u w:val="thick"/>
+        </w:rPr>
+        <w:t xml:space="preserve"> </w:t>
+      </w:r>
+      <w:r>
+        <w:rPr>
+          <w:rFonts w:ascii="Arial" w:hAnsi="Arial"/>
+          <w:b/>
+          <w:i/>
         </w:rPr>
         <w:t>PERMUTA</w:t>
       </w:r>
@@ -2613,18 +2561,14 @@
           <w:b/>
           <w:i/>
           <w:spacing w:val="-2"/>
-          <w:sz w:val="20"/>
-          <w:u w:val="thick"/>
-        </w:rPr>
-        <w:t xml:space="preserve"> </w:t>
-      </w:r>
-      <w:r>
-        <w:rPr>
-          <w:rFonts w:ascii="Arial" w:hAnsi="Arial"/>
-          <w:b/>
-          <w:i/>
-          <w:sz w:val="20"/>
-          <w:u w:val="thick"/>
+        </w:rPr>
+        <w:t xml:space="preserve"> </w:t>
+      </w:r>
+      <w:r>
+        <w:rPr>
+          <w:rFonts w:ascii="Arial" w:hAnsi="Arial"/>
+          <w:b/>
+          <w:i/>
         </w:rPr>
         <w:t>DE</w:t>
       </w:r>
@@ -2634,18 +2578,14 @@
           <w:b/>
           <w:i/>
           <w:spacing w:val="-1"/>
-          <w:sz w:val="20"/>
-          <w:u w:val="thick"/>
-        </w:rPr>
-        <w:t xml:space="preserve"> </w:t>
-      </w:r>
-      <w:r>
-        <w:rPr>
-          <w:rFonts w:ascii="Arial" w:hAnsi="Arial"/>
-          <w:b/>
-          <w:i/>
-          <w:sz w:val="20"/>
-          <w:u w:val="thick"/>
+        </w:rPr>
+        <w:t xml:space="preserve"> </w:t>
+      </w:r>
+      <w:r>
+        <w:rPr>
+          <w:rFonts w:ascii="Arial" w:hAnsi="Arial"/>
+          <w:b/>
+          <w:i/>
         </w:rPr>
         <w:t>PLANTÃO</w:t>
       </w:r>
@@ -2655,18 +2595,15 @@
           <w:b/>
           <w:i/>
           <w:spacing w:val="-3"/>
-          <w:sz w:val="20"/>
-          <w:u w:val="thick"/>
-        </w:rPr>
-        <w:t xml:space="preserve"> </w:t>
-      </w:r>
-      <w:r>
-        <w:rPr>
-          <w:rFonts w:ascii="Arial" w:hAnsi="Arial"/>
-          <w:b/>
-          <w:i/>
-          <w:sz w:val="20"/>
-          <w:u w:val="thick"/>
+        </w:rPr>
+        <w:t xml:space="preserve"> </w:t>
+      </w:r>
+      <w:r>
+        <w:rPr>
+          <w:rFonts w:ascii="Arial" w:hAnsi="Arial"/>
+          <w:b/>
+          <w:i/>
+          <w:highlight w:val="yellow"/>
         </w:rPr>
         <w:t>ENVIADOS</w:t>
       </w:r>
@@ -2676,18 +2613,16 @@
           <w:b/>
           <w:i/>
           <w:spacing w:val="-1"/>
-          <w:sz w:val="20"/>
-          <w:u w:val="thick"/>
-        </w:rPr>
-        <w:t xml:space="preserve"> </w:t>
-      </w:r>
-      <w:r>
-        <w:rPr>
-          <w:rFonts w:ascii="Arial" w:hAnsi="Arial"/>
-          <w:b/>
-          <w:i/>
-          <w:sz w:val="20"/>
-          <w:u w:val="thick"/>
+          <w:highlight w:val="yellow"/>
+        </w:rPr>
+        <w:t xml:space="preserve"> </w:t>
+      </w:r>
+      <w:r>
+        <w:rPr>
+          <w:rFonts w:ascii="Arial" w:hAnsi="Arial"/>
+          <w:b/>
+          <w:i/>
+          <w:highlight w:val="yellow"/>
         </w:rPr>
         <w:t>POR</w:t>
       </w:r>
@@ -2697,18 +2632,16 @@
           <w:b/>
           <w:i/>
           <w:spacing w:val="-1"/>
-          <w:sz w:val="20"/>
-          <w:u w:val="thick"/>
-        </w:rPr>
-        <w:t xml:space="preserve"> </w:t>
-      </w:r>
-      <w:r>
-        <w:rPr>
-          <w:rFonts w:ascii="Arial" w:hAnsi="Arial"/>
-          <w:b/>
-          <w:i/>
-          <w:sz w:val="20"/>
-          <w:u w:val="thick"/>
+          <w:highlight w:val="yellow"/>
+        </w:rPr>
+        <w:t xml:space="preserve"> </w:t>
+      </w:r>
+      <w:r>
+        <w:rPr>
+          <w:rFonts w:ascii="Arial" w:hAnsi="Arial"/>
+          <w:b/>
+          <w:i/>
+          <w:highlight w:val="yellow"/>
         </w:rPr>
         <w:t>E-MAIL.</w:t>
       </w:r>
@@ -2732,6 +2665,7 @@
           <w:b/>
           <w:i/>
           <w:sz w:val="20"/>
+          <w:lang w:val="pt-BR"/>
         </w:rPr>
       </w:pPr>
     </w:p>

</xml_diff>